<commit_message>
fix rank based pull elite strategy
</commit_message>
<xml_diff>
--- a/master-slave/evaluate-results/danh-gia-ket-qua-2.docx
+++ b/master-slave/evaluate-results/danh-gia-ket-qua-2.docx
@@ -7379,10 +7379,7 @@
         <w:t>, 8</w:t>
       </w:r>
       <w:r>
-        <w:t>)</w:t>
-      </w:r>
-      <w:r>
-        <w:t>, c</w:t>
+        <w:t>), c</w:t>
       </w:r>
       <w:r>
         <w:t xml:space="preserve">hiến lược </w:t>
@@ -7447,13 +7444,7 @@
         <w:t>=</w:t>
       </w:r>
       <w:r>
-        <w:t xml:space="preserve"> 10</w:t>
-      </w:r>
-      <w:r>
-        <w:t xml:space="preserve">, </w:t>
-      </w:r>
-      <w:r>
-        <w:t xml:space="preserve">chiến lược </w:t>
+        <w:t xml:space="preserve"> 10, chiến lược </w:t>
       </w:r>
       <w:r>
         <w:rPr>
@@ -7463,19 +7454,7 @@
         <w:t>đa dạng tham số chấm điểm neighborhood</w:t>
       </w:r>
       <w:r>
-        <w:t xml:space="preserve"> cho kết quả Best, Avg </w:t>
-      </w:r>
-      <w:r>
-        <w:t>không</w:t>
-      </w:r>
-      <w:r>
-        <w:t xml:space="preserve"> tốt </w:t>
-      </w:r>
-      <w:r>
-        <w:t>bằng</w:t>
-      </w:r>
-      <w:r>
-        <w:t xml:space="preserve"> khi so sánh với chiến lược </w:t>
+        <w:t xml:space="preserve"> cho kết quả Best, Avg không tốt bằng khi so sánh với chiến lược </w:t>
       </w:r>
       <w:r>
         <w:rPr>
@@ -7497,10 +7476,7 @@
         <w:t>hệ số biến thiên thấp hơn</w:t>
       </w:r>
       <w:r>
-        <w:t xml:space="preserve"> và </w:t>
-      </w:r>
-      <w:r>
-        <w:t>thời gian chạy trung bình nhanh hơn</w:t>
+        <w:t xml:space="preserve"> và thời gian chạy trung bình nhanh hơn</w:t>
       </w:r>
     </w:p>
     <w:p>
@@ -7508,10 +7484,7 @@
         <w:ind w:left="1080"/>
       </w:pPr>
       <w:r>
-        <w:t xml:space="preserve">=&gt; Trên cùng thời gian chạy, </w:t>
-      </w:r>
-      <w:r>
-        <w:t xml:space="preserve">chiến lược </w:t>
+        <w:t xml:space="preserve">=&gt; Trên cùng thời gian chạy, chiến lược </w:t>
       </w:r>
       <w:r>
         <w:rPr>
@@ -13410,6 +13383,18 @@
         <w:rPr>
           <w:rFonts w:cs="Times New Roman"/>
         </w:rPr>
+        <w:t>, 1</w:t>
+      </w:r>
+      <w:r>
+        <w:rPr>
+          <w:rFonts w:cs="Times New Roman"/>
+        </w:rPr>
+        <w:t>2</w:t>
+      </w:r>
+      <w:r>
+        <w:rPr>
+          <w:rFonts w:cs="Times New Roman"/>
+        </w:rPr>
         <w:t xml:space="preserve"> rồi</w:t>
       </w:r>
       <w:r>
@@ -13423,20 +13408,38 @@
         <w:tblLook w:val="04A0" w:firstRow="1" w:lastRow="0" w:firstColumn="1" w:lastColumn="0" w:noHBand="0" w:noVBand="1"/>
       </w:tblPr>
       <w:tblGrid>
+        <w:gridCol w:w="557"/>
         <w:gridCol w:w="1243"/>
-        <w:gridCol w:w="896"/>
-        <w:gridCol w:w="896"/>
-        <w:gridCol w:w="869"/>
-        <w:gridCol w:w="896"/>
-        <w:gridCol w:w="898"/>
-        <w:gridCol w:w="897"/>
+        <w:gridCol w:w="883"/>
+        <w:gridCol w:w="883"/>
+        <w:gridCol w:w="712"/>
+        <w:gridCol w:w="802"/>
+        <w:gridCol w:w="883"/>
+        <w:gridCol w:w="883"/>
         <w:gridCol w:w="990"/>
-        <w:gridCol w:w="869"/>
-        <w:gridCol w:w="896"/>
+        <w:gridCol w:w="712"/>
+        <w:gridCol w:w="802"/>
       </w:tblGrid>
       <w:tr>
         <w:tc>
           <w:tcPr>
+            <w:tcW w:w="557" w:type="dxa"/>
+            <w:vMerge w:val="restart"/>
+          </w:tcPr>
+          <w:p>
+            <w:pPr>
+              <w:jc w:val="center"/>
+            </w:pPr>
+            <w:r>
+              <w:rPr>
+                <w:rFonts w:cs="Times New Roman"/>
+              </w:rPr>
+              <w:t>µ</w:t>
+            </w:r>
+          </w:p>
+        </w:tc>
+        <w:tc>
+          <w:tcPr>
             <w:tcW w:w="1243" w:type="dxa"/>
             <w:vMerge w:val="restart"/>
           </w:tcPr>
@@ -13451,7 +13454,7 @@
         </w:tc>
         <w:tc>
           <w:tcPr>
-            <w:tcW w:w="3599" w:type="dxa"/>
+            <w:tcW w:w="3280" w:type="dxa"/>
             <w:gridSpan w:val="4"/>
           </w:tcPr>
           <w:p>
@@ -13465,7 +13468,7 @@
         </w:tc>
         <w:tc>
           <w:tcPr>
-            <w:tcW w:w="4508" w:type="dxa"/>
+            <w:tcW w:w="4270" w:type="dxa"/>
             <w:gridSpan w:val="5"/>
           </w:tcPr>
           <w:p>
@@ -13481,6 +13484,17 @@
       <w:tr>
         <w:tc>
           <w:tcPr>
+            <w:tcW w:w="557" w:type="dxa"/>
+            <w:vMerge/>
+          </w:tcPr>
+          <w:p>
+            <w:pPr>
+              <w:jc w:val="center"/>
+            </w:pPr>
+          </w:p>
+        </w:tc>
+        <w:tc>
+          <w:tcPr>
             <w:tcW w:w="1243" w:type="dxa"/>
             <w:vMerge/>
           </w:tcPr>
@@ -13492,7 +13506,7 @@
         </w:tc>
         <w:tc>
           <w:tcPr>
-            <w:tcW w:w="899" w:type="dxa"/>
+            <w:tcW w:w="883" w:type="dxa"/>
           </w:tcPr>
           <w:p>
             <w:pPr>
@@ -13505,7 +13519,7 @@
         </w:tc>
         <w:tc>
           <w:tcPr>
-            <w:tcW w:w="898" w:type="dxa"/>
+            <w:tcW w:w="883" w:type="dxa"/>
           </w:tcPr>
           <w:p>
             <w:pPr>
@@ -13518,7 +13532,7 @@
         </w:tc>
         <w:tc>
           <w:tcPr>
-            <w:tcW w:w="892" w:type="dxa"/>
+            <w:tcW w:w="712" w:type="dxa"/>
           </w:tcPr>
           <w:p>
             <w:pPr>
@@ -13531,7 +13545,7 @@
         </w:tc>
         <w:tc>
           <w:tcPr>
-            <w:tcW w:w="910" w:type="dxa"/>
+            <w:tcW w:w="802" w:type="dxa"/>
           </w:tcPr>
           <w:p>
             <w:pPr>
@@ -13544,7 +13558,7 @@
         </w:tc>
         <w:tc>
           <w:tcPr>
-            <w:tcW w:w="900" w:type="dxa"/>
+            <w:tcW w:w="883" w:type="dxa"/>
           </w:tcPr>
           <w:p>
             <w:pPr>
@@ -13557,7 +13571,7 @@
         </w:tc>
         <w:tc>
           <w:tcPr>
-            <w:tcW w:w="899" w:type="dxa"/>
+            <w:tcW w:w="883" w:type="dxa"/>
           </w:tcPr>
           <w:p>
             <w:pPr>
@@ -13570,7 +13584,7 @@
         </w:tc>
         <w:tc>
           <w:tcPr>
-            <w:tcW w:w="907" w:type="dxa"/>
+            <w:tcW w:w="990" w:type="dxa"/>
           </w:tcPr>
           <w:p>
             <w:pPr>
@@ -13585,16 +13599,13 @@
               <w:jc w:val="center"/>
             </w:pPr>
             <w:r>
-              <w:t>Avg</w:t>
-            </w:r>
-            <w:r>
-              <w:t>(%)</w:t>
-            </w:r>
-          </w:p>
-        </w:tc>
-        <w:tc>
-          <w:tcPr>
-            <w:tcW w:w="892" w:type="dxa"/>
+              <w:t>Avg(%)</w:t>
+            </w:r>
+          </w:p>
+        </w:tc>
+        <w:tc>
+          <w:tcPr>
+            <w:tcW w:w="712" w:type="dxa"/>
           </w:tcPr>
           <w:p>
             <w:pPr>
@@ -13607,7 +13618,7 @@
         </w:tc>
         <w:tc>
           <w:tcPr>
-            <w:tcW w:w="910" w:type="dxa"/>
+            <w:tcW w:w="802" w:type="dxa"/>
           </w:tcPr>
           <w:p>
             <w:pPr>
@@ -13622,6 +13633,35 @@
       <w:tr>
         <w:tc>
           <w:tcPr>
+            <w:tcW w:w="557" w:type="dxa"/>
+            <w:vMerge w:val="restart"/>
+          </w:tcPr>
+          <w:p>
+            <w:pPr>
+              <w:jc w:val="center"/>
+            </w:pPr>
+          </w:p>
+          <w:p>
+            <w:pPr>
+              <w:jc w:val="center"/>
+            </w:pPr>
+          </w:p>
+          <w:p>
+            <w:pPr>
+              <w:jc w:val="center"/>
+            </w:pPr>
+          </w:p>
+          <w:p>
+            <w:pPr>
+              <w:jc w:val="center"/>
+            </w:pPr>
+            <w:r>
+              <w:t>6</w:t>
+            </w:r>
+          </w:p>
+        </w:tc>
+        <w:tc>
+          <w:tcPr>
             <w:tcW w:w="1243" w:type="dxa"/>
           </w:tcPr>
           <w:p>
@@ -13635,7 +13675,7 @@
         </w:tc>
         <w:tc>
           <w:tcPr>
-            <w:tcW w:w="899" w:type="dxa"/>
+            <w:tcW w:w="883" w:type="dxa"/>
           </w:tcPr>
           <w:p>
             <w:r>
@@ -13645,7 +13685,7 @@
         </w:tc>
         <w:tc>
           <w:tcPr>
-            <w:tcW w:w="898" w:type="dxa"/>
+            <w:tcW w:w="883" w:type="dxa"/>
           </w:tcPr>
           <w:p>
             <w:r>
@@ -13655,7 +13695,7 @@
         </w:tc>
         <w:tc>
           <w:tcPr>
-            <w:tcW w:w="892" w:type="dxa"/>
+            <w:tcW w:w="712" w:type="dxa"/>
           </w:tcPr>
           <w:p>
             <w:r>
@@ -13665,7 +13705,7 @@
         </w:tc>
         <w:tc>
           <w:tcPr>
-            <w:tcW w:w="910" w:type="dxa"/>
+            <w:tcW w:w="802" w:type="dxa"/>
           </w:tcPr>
           <w:p>
             <w:r>
@@ -13675,7 +13715,7 @@
         </w:tc>
         <w:tc>
           <w:tcPr>
-            <w:tcW w:w="900" w:type="dxa"/>
+            <w:tcW w:w="883" w:type="dxa"/>
           </w:tcPr>
           <w:p>
             <w:pPr>
@@ -13695,7 +13735,7 @@
         </w:tc>
         <w:tc>
           <w:tcPr>
-            <w:tcW w:w="899" w:type="dxa"/>
+            <w:tcW w:w="883" w:type="dxa"/>
           </w:tcPr>
           <w:p>
             <w:r>
@@ -13705,17 +13745,27 @@
         </w:tc>
         <w:tc>
           <w:tcPr>
-            <w:tcW w:w="907" w:type="dxa"/>
-          </w:tcPr>
-          <w:p>
-            <w:r>
+            <w:tcW w:w="990" w:type="dxa"/>
+          </w:tcPr>
+          <w:p>
+            <w:pPr>
+              <w:rPr>
+                <w:b/>
+                <w:bCs/>
+              </w:rPr>
+            </w:pPr>
+            <w:r>
+              <w:rPr>
+                <w:b/>
+                <w:bCs/>
+              </w:rPr>
               <w:t>0.00</w:t>
             </w:r>
           </w:p>
         </w:tc>
         <w:tc>
           <w:tcPr>
-            <w:tcW w:w="892" w:type="dxa"/>
+            <w:tcW w:w="712" w:type="dxa"/>
           </w:tcPr>
           <w:p>
             <w:r>
@@ -13725,7 +13775,7 @@
         </w:tc>
         <w:tc>
           <w:tcPr>
-            <w:tcW w:w="910" w:type="dxa"/>
+            <w:tcW w:w="802" w:type="dxa"/>
           </w:tcPr>
           <w:p>
             <w:r>
@@ -13737,6 +13787,17 @@
       <w:tr>
         <w:tc>
           <w:tcPr>
+            <w:tcW w:w="557" w:type="dxa"/>
+            <w:vMerge/>
+          </w:tcPr>
+          <w:p>
+            <w:pPr>
+              <w:jc w:val="center"/>
+            </w:pPr>
+          </w:p>
+        </w:tc>
+        <w:tc>
+          <w:tcPr>
             <w:tcW w:w="1243" w:type="dxa"/>
           </w:tcPr>
           <w:p>
@@ -13750,7 +13811,7 @@
         </w:tc>
         <w:tc>
           <w:tcPr>
-            <w:tcW w:w="899" w:type="dxa"/>
+            <w:tcW w:w="883" w:type="dxa"/>
           </w:tcPr>
           <w:p>
             <w:r>
@@ -13760,7 +13821,7 @@
         </w:tc>
         <w:tc>
           <w:tcPr>
-            <w:tcW w:w="898" w:type="dxa"/>
+            <w:tcW w:w="883" w:type="dxa"/>
           </w:tcPr>
           <w:p>
             <w:r>
@@ -13770,7 +13831,7 @@
         </w:tc>
         <w:tc>
           <w:tcPr>
-            <w:tcW w:w="892" w:type="dxa"/>
+            <w:tcW w:w="712" w:type="dxa"/>
           </w:tcPr>
           <w:p>
             <w:r>
@@ -13780,7 +13841,7 @@
         </w:tc>
         <w:tc>
           <w:tcPr>
-            <w:tcW w:w="910" w:type="dxa"/>
+            <w:tcW w:w="802" w:type="dxa"/>
           </w:tcPr>
           <w:p>
             <w:r>
@@ -13790,7 +13851,7 @@
         </w:tc>
         <w:tc>
           <w:tcPr>
-            <w:tcW w:w="900" w:type="dxa"/>
+            <w:tcW w:w="883" w:type="dxa"/>
           </w:tcPr>
           <w:p>
             <w:pPr>
@@ -13810,37 +13871,47 @@
         </w:tc>
         <w:tc>
           <w:tcPr>
-            <w:tcW w:w="899" w:type="dxa"/>
-          </w:tcPr>
-          <w:p>
-            <w:r>
-              <w:t>50.07</w:t>
-            </w:r>
-          </w:p>
-        </w:tc>
-        <w:tc>
-          <w:tcPr>
-            <w:tcW w:w="907" w:type="dxa"/>
-          </w:tcPr>
-          <w:p>
-            <w:r>
-              <w:t>0.10</w:t>
-            </w:r>
-          </w:p>
-        </w:tc>
-        <w:tc>
-          <w:tcPr>
-            <w:tcW w:w="892" w:type="dxa"/>
-          </w:tcPr>
-          <w:p>
-            <w:r>
-              <w:t>0.24</w:t>
-            </w:r>
-          </w:p>
-        </w:tc>
-        <w:tc>
-          <w:tcPr>
-            <w:tcW w:w="910" w:type="dxa"/>
+            <w:tcW w:w="883" w:type="dxa"/>
+          </w:tcPr>
+          <w:p>
+            <w:r>
+              <w:t>50.02</w:t>
+            </w:r>
+          </w:p>
+        </w:tc>
+        <w:tc>
+          <w:tcPr>
+            <w:tcW w:w="990" w:type="dxa"/>
+          </w:tcPr>
+          <w:p>
+            <w:pPr>
+              <w:rPr>
+                <w:b/>
+                <w:bCs/>
+              </w:rPr>
+            </w:pPr>
+            <w:r>
+              <w:rPr>
+                <w:b/>
+                <w:bCs/>
+              </w:rPr>
+              <w:t>0.00</w:t>
+            </w:r>
+          </w:p>
+        </w:tc>
+        <w:tc>
+          <w:tcPr>
+            <w:tcW w:w="712" w:type="dxa"/>
+          </w:tcPr>
+          <w:p>
+            <w:r>
+              <w:t>0.00</w:t>
+            </w:r>
+          </w:p>
+        </w:tc>
+        <w:tc>
+          <w:tcPr>
+            <w:tcW w:w="802" w:type="dxa"/>
           </w:tcPr>
           <w:p>
             <w:r>
@@ -13852,6 +13923,17 @@
       <w:tr>
         <w:tc>
           <w:tcPr>
+            <w:tcW w:w="557" w:type="dxa"/>
+            <w:vMerge/>
+          </w:tcPr>
+          <w:p>
+            <w:pPr>
+              <w:jc w:val="center"/>
+            </w:pPr>
+          </w:p>
+        </w:tc>
+        <w:tc>
+          <w:tcPr>
             <w:tcW w:w="1243" w:type="dxa"/>
           </w:tcPr>
           <w:p>
@@ -13865,7 +13947,7 @@
         </w:tc>
         <w:tc>
           <w:tcPr>
-            <w:tcW w:w="899" w:type="dxa"/>
+            <w:tcW w:w="883" w:type="dxa"/>
           </w:tcPr>
           <w:p>
             <w:pPr>
@@ -13887,7 +13969,7 @@
         </w:tc>
         <w:tc>
           <w:tcPr>
-            <w:tcW w:w="898" w:type="dxa"/>
+            <w:tcW w:w="883" w:type="dxa"/>
           </w:tcPr>
           <w:p>
             <w:r>
@@ -13897,7 +13979,7 @@
         </w:tc>
         <w:tc>
           <w:tcPr>
-            <w:tcW w:w="892" w:type="dxa"/>
+            <w:tcW w:w="712" w:type="dxa"/>
           </w:tcPr>
           <w:p>
             <w:r>
@@ -13907,7 +13989,7 @@
         </w:tc>
         <w:tc>
           <w:tcPr>
-            <w:tcW w:w="910" w:type="dxa"/>
+            <w:tcW w:w="802" w:type="dxa"/>
           </w:tcPr>
           <w:p>
             <w:r>
@@ -13917,7 +13999,7 @@
         </w:tc>
         <w:tc>
           <w:tcPr>
-            <w:tcW w:w="900" w:type="dxa"/>
+            <w:tcW w:w="883" w:type="dxa"/>
           </w:tcPr>
           <w:p>
             <w:r>
@@ -13927,7 +14009,7 @@
         </w:tc>
         <w:tc>
           <w:tcPr>
-            <w:tcW w:w="899" w:type="dxa"/>
+            <w:tcW w:w="883" w:type="dxa"/>
           </w:tcPr>
           <w:p>
             <w:r>
@@ -13937,7 +14019,7 @@
         </w:tc>
         <w:tc>
           <w:tcPr>
-            <w:tcW w:w="907" w:type="dxa"/>
+            <w:tcW w:w="990" w:type="dxa"/>
           </w:tcPr>
           <w:p>
             <w:r>
@@ -13947,7 +14029,7 @@
         </w:tc>
         <w:tc>
           <w:tcPr>
-            <w:tcW w:w="892" w:type="dxa"/>
+            <w:tcW w:w="712" w:type="dxa"/>
           </w:tcPr>
           <w:p>
             <w:r>
@@ -13957,7 +14039,7 @@
         </w:tc>
         <w:tc>
           <w:tcPr>
-            <w:tcW w:w="910" w:type="dxa"/>
+            <w:tcW w:w="802" w:type="dxa"/>
           </w:tcPr>
           <w:p>
             <w:r>
@@ -13969,6 +14051,17 @@
       <w:tr>
         <w:tc>
           <w:tcPr>
+            <w:tcW w:w="557" w:type="dxa"/>
+            <w:vMerge/>
+          </w:tcPr>
+          <w:p>
+            <w:pPr>
+              <w:jc w:val="center"/>
+            </w:pPr>
+          </w:p>
+        </w:tc>
+        <w:tc>
+          <w:tcPr>
             <w:tcW w:w="1243" w:type="dxa"/>
           </w:tcPr>
           <w:p>
@@ -13982,7 +14075,7 @@
         </w:tc>
         <w:tc>
           <w:tcPr>
-            <w:tcW w:w="899" w:type="dxa"/>
+            <w:tcW w:w="883" w:type="dxa"/>
           </w:tcPr>
           <w:p>
             <w:r>
@@ -13992,7 +14085,7 @@
         </w:tc>
         <w:tc>
           <w:tcPr>
-            <w:tcW w:w="898" w:type="dxa"/>
+            <w:tcW w:w="883" w:type="dxa"/>
           </w:tcPr>
           <w:p>
             <w:r>
@@ -14002,7 +14095,7 @@
         </w:tc>
         <w:tc>
           <w:tcPr>
-            <w:tcW w:w="892" w:type="dxa"/>
+            <w:tcW w:w="712" w:type="dxa"/>
           </w:tcPr>
           <w:p>
             <w:r>
@@ -14012,7 +14105,7 @@
         </w:tc>
         <w:tc>
           <w:tcPr>
-            <w:tcW w:w="910" w:type="dxa"/>
+            <w:tcW w:w="802" w:type="dxa"/>
           </w:tcPr>
           <w:p>
             <w:r>
@@ -14022,7 +14115,7 @@
         </w:tc>
         <w:tc>
           <w:tcPr>
-            <w:tcW w:w="900" w:type="dxa"/>
+            <w:tcW w:w="883" w:type="dxa"/>
           </w:tcPr>
           <w:p>
             <w:pPr>
@@ -14042,7 +14135,7 @@
         </w:tc>
         <w:tc>
           <w:tcPr>
-            <w:tcW w:w="899" w:type="dxa"/>
+            <w:tcW w:w="883" w:type="dxa"/>
           </w:tcPr>
           <w:p>
             <w:r>
@@ -14052,7 +14145,7 @@
         </w:tc>
         <w:tc>
           <w:tcPr>
-            <w:tcW w:w="907" w:type="dxa"/>
+            <w:tcW w:w="990" w:type="dxa"/>
           </w:tcPr>
           <w:p>
             <w:r>
@@ -14062,7 +14155,7 @@
         </w:tc>
         <w:tc>
           <w:tcPr>
-            <w:tcW w:w="892" w:type="dxa"/>
+            <w:tcW w:w="712" w:type="dxa"/>
           </w:tcPr>
           <w:p>
             <w:r>
@@ -14072,7 +14165,7 @@
         </w:tc>
         <w:tc>
           <w:tcPr>
-            <w:tcW w:w="910" w:type="dxa"/>
+            <w:tcW w:w="802" w:type="dxa"/>
           </w:tcPr>
           <w:p>
             <w:r>
@@ -14084,6 +14177,17 @@
       <w:tr>
         <w:tc>
           <w:tcPr>
+            <w:tcW w:w="557" w:type="dxa"/>
+            <w:vMerge/>
+          </w:tcPr>
+          <w:p>
+            <w:pPr>
+              <w:jc w:val="center"/>
+            </w:pPr>
+          </w:p>
+        </w:tc>
+        <w:tc>
+          <w:tcPr>
             <w:tcW w:w="1243" w:type="dxa"/>
           </w:tcPr>
           <w:p>
@@ -14091,14 +14195,13 @@
               <w:jc w:val="center"/>
             </w:pPr>
             <w:r>
-              <w:lastRenderedPageBreak/>
               <w:t>50</w:t>
             </w:r>
           </w:p>
         </w:tc>
         <w:tc>
           <w:tcPr>
-            <w:tcW w:w="899" w:type="dxa"/>
+            <w:tcW w:w="883" w:type="dxa"/>
           </w:tcPr>
           <w:p>
             <w:pPr>
@@ -14120,7 +14223,7 @@
         </w:tc>
         <w:tc>
           <w:tcPr>
-            <w:tcW w:w="898" w:type="dxa"/>
+            <w:tcW w:w="883" w:type="dxa"/>
           </w:tcPr>
           <w:p>
             <w:r>
@@ -14130,7 +14233,7 @@
         </w:tc>
         <w:tc>
           <w:tcPr>
-            <w:tcW w:w="892" w:type="dxa"/>
+            <w:tcW w:w="712" w:type="dxa"/>
           </w:tcPr>
           <w:p>
             <w:r>
@@ -14140,7 +14243,7 @@
         </w:tc>
         <w:tc>
           <w:tcPr>
-            <w:tcW w:w="910" w:type="dxa"/>
+            <w:tcW w:w="802" w:type="dxa"/>
           </w:tcPr>
           <w:p>
             <w:r>
@@ -14150,7 +14253,7 @@
         </w:tc>
         <w:tc>
           <w:tcPr>
-            <w:tcW w:w="900" w:type="dxa"/>
+            <w:tcW w:w="883" w:type="dxa"/>
           </w:tcPr>
           <w:p>
             <w:r>
@@ -14160,7 +14263,7 @@
         </w:tc>
         <w:tc>
           <w:tcPr>
-            <w:tcW w:w="899" w:type="dxa"/>
+            <w:tcW w:w="883" w:type="dxa"/>
           </w:tcPr>
           <w:p>
             <w:r>
@@ -14170,7 +14273,7 @@
         </w:tc>
         <w:tc>
           <w:tcPr>
-            <w:tcW w:w="907" w:type="dxa"/>
+            <w:tcW w:w="990" w:type="dxa"/>
           </w:tcPr>
           <w:p>
             <w:pPr>
@@ -14190,7 +14293,7 @@
         </w:tc>
         <w:tc>
           <w:tcPr>
-            <w:tcW w:w="892" w:type="dxa"/>
+            <w:tcW w:w="712" w:type="dxa"/>
           </w:tcPr>
           <w:p>
             <w:r>
@@ -14200,7 +14303,7 @@
         </w:tc>
         <w:tc>
           <w:tcPr>
-            <w:tcW w:w="910" w:type="dxa"/>
+            <w:tcW w:w="802" w:type="dxa"/>
           </w:tcPr>
           <w:p>
             <w:r>
@@ -14212,6 +14315,17 @@
       <w:tr>
         <w:tc>
           <w:tcPr>
+            <w:tcW w:w="557" w:type="dxa"/>
+            <w:vMerge/>
+          </w:tcPr>
+          <w:p>
+            <w:pPr>
+              <w:jc w:val="center"/>
+            </w:pPr>
+          </w:p>
+        </w:tc>
+        <w:tc>
+          <w:tcPr>
             <w:tcW w:w="1243" w:type="dxa"/>
           </w:tcPr>
           <w:p>
@@ -14225,7 +14339,7 @@
         </w:tc>
         <w:tc>
           <w:tcPr>
-            <w:tcW w:w="899" w:type="dxa"/>
+            <w:tcW w:w="883" w:type="dxa"/>
           </w:tcPr>
           <w:p>
             <w:r>
@@ -14235,7 +14349,7 @@
         </w:tc>
         <w:tc>
           <w:tcPr>
-            <w:tcW w:w="898" w:type="dxa"/>
+            <w:tcW w:w="883" w:type="dxa"/>
           </w:tcPr>
           <w:p>
             <w:r>
@@ -14245,7 +14359,7 @@
         </w:tc>
         <w:tc>
           <w:tcPr>
-            <w:tcW w:w="892" w:type="dxa"/>
+            <w:tcW w:w="712" w:type="dxa"/>
           </w:tcPr>
           <w:p>
             <w:r>
@@ -14255,7 +14369,7 @@
         </w:tc>
         <w:tc>
           <w:tcPr>
-            <w:tcW w:w="910" w:type="dxa"/>
+            <w:tcW w:w="802" w:type="dxa"/>
           </w:tcPr>
           <w:p>
             <w:r>
@@ -14265,7 +14379,7 @@
         </w:tc>
         <w:tc>
           <w:tcPr>
-            <w:tcW w:w="900" w:type="dxa"/>
+            <w:tcW w:w="883" w:type="dxa"/>
           </w:tcPr>
           <w:p>
             <w:pPr>
@@ -14287,7 +14401,7 @@
         </w:tc>
         <w:tc>
           <w:tcPr>
-            <w:tcW w:w="899" w:type="dxa"/>
+            <w:tcW w:w="883" w:type="dxa"/>
           </w:tcPr>
           <w:p>
             <w:r>
@@ -14297,7 +14411,7 @@
         </w:tc>
         <w:tc>
           <w:tcPr>
-            <w:tcW w:w="907" w:type="dxa"/>
+            <w:tcW w:w="990" w:type="dxa"/>
           </w:tcPr>
           <w:p>
             <w:pPr>
@@ -14317,7 +14431,7 @@
         </w:tc>
         <w:tc>
           <w:tcPr>
-            <w:tcW w:w="892" w:type="dxa"/>
+            <w:tcW w:w="712" w:type="dxa"/>
           </w:tcPr>
           <w:p>
             <w:r>
@@ -14327,14 +14441,11 @@
         </w:tc>
         <w:tc>
           <w:tcPr>
-            <w:tcW w:w="910" w:type="dxa"/>
-          </w:tcPr>
-          <w:p>
-            <w:r>
-              <w:t>5.3</w:t>
-            </w:r>
-            <w:r>
-              <w:t>6</w:t>
+            <w:tcW w:w="802" w:type="dxa"/>
+          </w:tcPr>
+          <w:p>
+            <w:r>
+              <w:t>5.36</w:t>
             </w:r>
           </w:p>
         </w:tc>
@@ -14342,6 +14453,17 @@
       <w:tr>
         <w:tc>
           <w:tcPr>
+            <w:tcW w:w="557" w:type="dxa"/>
+            <w:vMerge/>
+          </w:tcPr>
+          <w:p>
+            <w:pPr>
+              <w:jc w:val="center"/>
+            </w:pPr>
+          </w:p>
+        </w:tc>
+        <w:tc>
+          <w:tcPr>
             <w:tcW w:w="1243" w:type="dxa"/>
           </w:tcPr>
           <w:p>
@@ -14355,7 +14477,7 @@
         </w:tc>
         <w:tc>
           <w:tcPr>
-            <w:tcW w:w="899" w:type="dxa"/>
+            <w:tcW w:w="883" w:type="dxa"/>
           </w:tcPr>
           <w:p>
             <w:r>
@@ -14365,7 +14487,7 @@
         </w:tc>
         <w:tc>
           <w:tcPr>
-            <w:tcW w:w="898" w:type="dxa"/>
+            <w:tcW w:w="883" w:type="dxa"/>
           </w:tcPr>
           <w:p>
             <w:r>
@@ -14375,7 +14497,7 @@
         </w:tc>
         <w:tc>
           <w:tcPr>
-            <w:tcW w:w="892" w:type="dxa"/>
+            <w:tcW w:w="712" w:type="dxa"/>
           </w:tcPr>
           <w:p>
             <w:r>
@@ -14385,7 +14507,7 @@
         </w:tc>
         <w:tc>
           <w:tcPr>
-            <w:tcW w:w="910" w:type="dxa"/>
+            <w:tcW w:w="802" w:type="dxa"/>
           </w:tcPr>
           <w:p>
             <w:r>
@@ -14395,7 +14517,7 @@
         </w:tc>
         <w:tc>
           <w:tcPr>
-            <w:tcW w:w="900" w:type="dxa"/>
+            <w:tcW w:w="883" w:type="dxa"/>
           </w:tcPr>
           <w:p>
             <w:pPr>
@@ -14417,7 +14539,7 @@
         </w:tc>
         <w:tc>
           <w:tcPr>
-            <w:tcW w:w="899" w:type="dxa"/>
+            <w:tcW w:w="883" w:type="dxa"/>
           </w:tcPr>
           <w:p>
             <w:r>
@@ -14427,7 +14549,7 @@
         </w:tc>
         <w:tc>
           <w:tcPr>
-            <w:tcW w:w="907" w:type="dxa"/>
+            <w:tcW w:w="990" w:type="dxa"/>
           </w:tcPr>
           <w:p>
             <w:pPr>
@@ -14447,7 +14569,7 @@
         </w:tc>
         <w:tc>
           <w:tcPr>
-            <w:tcW w:w="892" w:type="dxa"/>
+            <w:tcW w:w="712" w:type="dxa"/>
           </w:tcPr>
           <w:p>
             <w:r>
@@ -14457,13 +14579,696 @@
         </w:tc>
         <w:tc>
           <w:tcPr>
-            <w:tcW w:w="910" w:type="dxa"/>
+            <w:tcW w:w="802" w:type="dxa"/>
           </w:tcPr>
           <w:p>
             <w:r>
               <w:t>20.43</w:t>
             </w:r>
           </w:p>
+        </w:tc>
+      </w:tr>
+      <w:tr>
+        <w:tc>
+          <w:tcPr>
+            <w:tcW w:w="557" w:type="dxa"/>
+            <w:vMerge w:val="restart"/>
+          </w:tcPr>
+          <w:p>
+            <w:pPr>
+              <w:jc w:val="center"/>
+            </w:pPr>
+          </w:p>
+          <w:p>
+            <w:pPr>
+              <w:jc w:val="center"/>
+            </w:pPr>
+          </w:p>
+          <w:p>
+            <w:pPr>
+              <w:jc w:val="center"/>
+            </w:pPr>
+          </w:p>
+          <w:p>
+            <w:pPr>
+              <w:jc w:val="center"/>
+            </w:pPr>
+            <w:r>
+              <w:t>10</w:t>
+            </w:r>
+          </w:p>
+        </w:tc>
+        <w:tc>
+          <w:tcPr>
+            <w:tcW w:w="1243" w:type="dxa"/>
+          </w:tcPr>
+          <w:p>
+            <w:pPr>
+              <w:jc w:val="center"/>
+            </w:pPr>
+            <w:r>
+              <w:t>6</w:t>
+            </w:r>
+          </w:p>
+        </w:tc>
+        <w:tc>
+          <w:tcPr>
+            <w:tcW w:w="883" w:type="dxa"/>
+          </w:tcPr>
+          <w:p/>
+        </w:tc>
+        <w:tc>
+          <w:tcPr>
+            <w:tcW w:w="883" w:type="dxa"/>
+          </w:tcPr>
+          <w:p/>
+        </w:tc>
+        <w:tc>
+          <w:tcPr>
+            <w:tcW w:w="712" w:type="dxa"/>
+          </w:tcPr>
+          <w:p/>
+        </w:tc>
+        <w:tc>
+          <w:tcPr>
+            <w:tcW w:w="802" w:type="dxa"/>
+          </w:tcPr>
+          <w:p/>
+        </w:tc>
+        <w:tc>
+          <w:tcPr>
+            <w:tcW w:w="883" w:type="dxa"/>
+          </w:tcPr>
+          <w:p>
+            <w:pPr>
+              <w:rPr>
+                <w:b/>
+                <w:bCs/>
+                <w:u w:val="single"/>
+              </w:rPr>
+            </w:pPr>
+          </w:p>
+        </w:tc>
+        <w:tc>
+          <w:tcPr>
+            <w:tcW w:w="883" w:type="dxa"/>
+          </w:tcPr>
+          <w:p/>
+        </w:tc>
+        <w:tc>
+          <w:tcPr>
+            <w:tcW w:w="990" w:type="dxa"/>
+          </w:tcPr>
+          <w:p>
+            <w:pPr>
+              <w:rPr>
+                <w:b/>
+                <w:bCs/>
+              </w:rPr>
+            </w:pPr>
+          </w:p>
+        </w:tc>
+        <w:tc>
+          <w:tcPr>
+            <w:tcW w:w="712" w:type="dxa"/>
+          </w:tcPr>
+          <w:p/>
+        </w:tc>
+        <w:tc>
+          <w:tcPr>
+            <w:tcW w:w="802" w:type="dxa"/>
+          </w:tcPr>
+          <w:p/>
+        </w:tc>
+      </w:tr>
+      <w:tr>
+        <w:tc>
+          <w:tcPr>
+            <w:tcW w:w="557" w:type="dxa"/>
+            <w:vMerge/>
+          </w:tcPr>
+          <w:p>
+            <w:pPr>
+              <w:jc w:val="center"/>
+            </w:pPr>
+          </w:p>
+        </w:tc>
+        <w:tc>
+          <w:tcPr>
+            <w:tcW w:w="1243" w:type="dxa"/>
+          </w:tcPr>
+          <w:p>
+            <w:pPr>
+              <w:jc w:val="center"/>
+            </w:pPr>
+            <w:r>
+              <w:t>10</w:t>
+            </w:r>
+          </w:p>
+        </w:tc>
+        <w:tc>
+          <w:tcPr>
+            <w:tcW w:w="883" w:type="dxa"/>
+          </w:tcPr>
+          <w:p/>
+        </w:tc>
+        <w:tc>
+          <w:tcPr>
+            <w:tcW w:w="883" w:type="dxa"/>
+          </w:tcPr>
+          <w:p/>
+        </w:tc>
+        <w:tc>
+          <w:tcPr>
+            <w:tcW w:w="712" w:type="dxa"/>
+          </w:tcPr>
+          <w:p/>
+        </w:tc>
+        <w:tc>
+          <w:tcPr>
+            <w:tcW w:w="802" w:type="dxa"/>
+          </w:tcPr>
+          <w:p/>
+        </w:tc>
+        <w:tc>
+          <w:tcPr>
+            <w:tcW w:w="883" w:type="dxa"/>
+          </w:tcPr>
+          <w:p>
+            <w:pPr>
+              <w:rPr>
+                <w:b/>
+                <w:bCs/>
+                <w:u w:val="single"/>
+              </w:rPr>
+            </w:pPr>
+          </w:p>
+        </w:tc>
+        <w:tc>
+          <w:tcPr>
+            <w:tcW w:w="883" w:type="dxa"/>
+          </w:tcPr>
+          <w:p/>
+        </w:tc>
+        <w:tc>
+          <w:tcPr>
+            <w:tcW w:w="990" w:type="dxa"/>
+          </w:tcPr>
+          <w:p>
+            <w:pPr>
+              <w:rPr>
+                <w:b/>
+                <w:bCs/>
+              </w:rPr>
+            </w:pPr>
+          </w:p>
+        </w:tc>
+        <w:tc>
+          <w:tcPr>
+            <w:tcW w:w="712" w:type="dxa"/>
+          </w:tcPr>
+          <w:p/>
+        </w:tc>
+        <w:tc>
+          <w:tcPr>
+            <w:tcW w:w="802" w:type="dxa"/>
+          </w:tcPr>
+          <w:p/>
+        </w:tc>
+      </w:tr>
+      <w:tr>
+        <w:tc>
+          <w:tcPr>
+            <w:tcW w:w="557" w:type="dxa"/>
+            <w:vMerge/>
+          </w:tcPr>
+          <w:p>
+            <w:pPr>
+              <w:jc w:val="center"/>
+            </w:pPr>
+          </w:p>
+        </w:tc>
+        <w:tc>
+          <w:tcPr>
+            <w:tcW w:w="1243" w:type="dxa"/>
+          </w:tcPr>
+          <w:p>
+            <w:pPr>
+              <w:jc w:val="center"/>
+            </w:pPr>
+            <w:r>
+              <w:t>12</w:t>
+            </w:r>
+          </w:p>
+        </w:tc>
+        <w:tc>
+          <w:tcPr>
+            <w:tcW w:w="883" w:type="dxa"/>
+          </w:tcPr>
+          <w:p/>
+        </w:tc>
+        <w:tc>
+          <w:tcPr>
+            <w:tcW w:w="883" w:type="dxa"/>
+          </w:tcPr>
+          <w:p/>
+        </w:tc>
+        <w:tc>
+          <w:tcPr>
+            <w:tcW w:w="712" w:type="dxa"/>
+          </w:tcPr>
+          <w:p/>
+        </w:tc>
+        <w:tc>
+          <w:tcPr>
+            <w:tcW w:w="802" w:type="dxa"/>
+          </w:tcPr>
+          <w:p/>
+        </w:tc>
+        <w:tc>
+          <w:tcPr>
+            <w:tcW w:w="883" w:type="dxa"/>
+          </w:tcPr>
+          <w:p>
+            <w:pPr>
+              <w:rPr>
+                <w:b/>
+                <w:bCs/>
+                <w:u w:val="single"/>
+              </w:rPr>
+            </w:pPr>
+          </w:p>
+        </w:tc>
+        <w:tc>
+          <w:tcPr>
+            <w:tcW w:w="883" w:type="dxa"/>
+          </w:tcPr>
+          <w:p/>
+        </w:tc>
+        <w:tc>
+          <w:tcPr>
+            <w:tcW w:w="990" w:type="dxa"/>
+          </w:tcPr>
+          <w:p>
+            <w:pPr>
+              <w:rPr>
+                <w:b/>
+                <w:bCs/>
+              </w:rPr>
+            </w:pPr>
+          </w:p>
+        </w:tc>
+        <w:tc>
+          <w:tcPr>
+            <w:tcW w:w="712" w:type="dxa"/>
+          </w:tcPr>
+          <w:p/>
+        </w:tc>
+        <w:tc>
+          <w:tcPr>
+            <w:tcW w:w="802" w:type="dxa"/>
+          </w:tcPr>
+          <w:p/>
+        </w:tc>
+      </w:tr>
+      <w:tr>
+        <w:tc>
+          <w:tcPr>
+            <w:tcW w:w="557" w:type="dxa"/>
+            <w:vMerge/>
+          </w:tcPr>
+          <w:p>
+            <w:pPr>
+              <w:jc w:val="center"/>
+            </w:pPr>
+          </w:p>
+        </w:tc>
+        <w:tc>
+          <w:tcPr>
+            <w:tcW w:w="1243" w:type="dxa"/>
+          </w:tcPr>
+          <w:p>
+            <w:pPr>
+              <w:jc w:val="center"/>
+            </w:pPr>
+            <w:r>
+              <w:t>20</w:t>
+            </w:r>
+          </w:p>
+        </w:tc>
+        <w:tc>
+          <w:tcPr>
+            <w:tcW w:w="883" w:type="dxa"/>
+          </w:tcPr>
+          <w:p/>
+        </w:tc>
+        <w:tc>
+          <w:tcPr>
+            <w:tcW w:w="883" w:type="dxa"/>
+          </w:tcPr>
+          <w:p/>
+        </w:tc>
+        <w:tc>
+          <w:tcPr>
+            <w:tcW w:w="712" w:type="dxa"/>
+          </w:tcPr>
+          <w:p/>
+        </w:tc>
+        <w:tc>
+          <w:tcPr>
+            <w:tcW w:w="802" w:type="dxa"/>
+          </w:tcPr>
+          <w:p/>
+        </w:tc>
+        <w:tc>
+          <w:tcPr>
+            <w:tcW w:w="883" w:type="dxa"/>
+          </w:tcPr>
+          <w:p>
+            <w:pPr>
+              <w:rPr>
+                <w:b/>
+                <w:bCs/>
+                <w:u w:val="single"/>
+              </w:rPr>
+            </w:pPr>
+          </w:p>
+        </w:tc>
+        <w:tc>
+          <w:tcPr>
+            <w:tcW w:w="883" w:type="dxa"/>
+          </w:tcPr>
+          <w:p/>
+        </w:tc>
+        <w:tc>
+          <w:tcPr>
+            <w:tcW w:w="990" w:type="dxa"/>
+          </w:tcPr>
+          <w:p>
+            <w:pPr>
+              <w:rPr>
+                <w:b/>
+                <w:bCs/>
+              </w:rPr>
+            </w:pPr>
+          </w:p>
+        </w:tc>
+        <w:tc>
+          <w:tcPr>
+            <w:tcW w:w="712" w:type="dxa"/>
+          </w:tcPr>
+          <w:p/>
+        </w:tc>
+        <w:tc>
+          <w:tcPr>
+            <w:tcW w:w="802" w:type="dxa"/>
+          </w:tcPr>
+          <w:p/>
+        </w:tc>
+      </w:tr>
+      <w:tr>
+        <w:tc>
+          <w:tcPr>
+            <w:tcW w:w="557" w:type="dxa"/>
+            <w:vMerge/>
+          </w:tcPr>
+          <w:p>
+            <w:pPr>
+              <w:jc w:val="center"/>
+            </w:pPr>
+          </w:p>
+        </w:tc>
+        <w:tc>
+          <w:tcPr>
+            <w:tcW w:w="1243" w:type="dxa"/>
+          </w:tcPr>
+          <w:p>
+            <w:pPr>
+              <w:jc w:val="center"/>
+            </w:pPr>
+            <w:r>
+              <w:t>50</w:t>
+            </w:r>
+          </w:p>
+        </w:tc>
+        <w:tc>
+          <w:tcPr>
+            <w:tcW w:w="883" w:type="dxa"/>
+          </w:tcPr>
+          <w:p/>
+        </w:tc>
+        <w:tc>
+          <w:tcPr>
+            <w:tcW w:w="883" w:type="dxa"/>
+          </w:tcPr>
+          <w:p/>
+        </w:tc>
+        <w:tc>
+          <w:tcPr>
+            <w:tcW w:w="712" w:type="dxa"/>
+          </w:tcPr>
+          <w:p/>
+        </w:tc>
+        <w:tc>
+          <w:tcPr>
+            <w:tcW w:w="802" w:type="dxa"/>
+          </w:tcPr>
+          <w:p/>
+        </w:tc>
+        <w:tc>
+          <w:tcPr>
+            <w:tcW w:w="883" w:type="dxa"/>
+          </w:tcPr>
+          <w:p>
+            <w:pPr>
+              <w:rPr>
+                <w:b/>
+                <w:bCs/>
+                <w:u w:val="single"/>
+              </w:rPr>
+            </w:pPr>
+          </w:p>
+        </w:tc>
+        <w:tc>
+          <w:tcPr>
+            <w:tcW w:w="883" w:type="dxa"/>
+          </w:tcPr>
+          <w:p/>
+        </w:tc>
+        <w:tc>
+          <w:tcPr>
+            <w:tcW w:w="990" w:type="dxa"/>
+          </w:tcPr>
+          <w:p>
+            <w:pPr>
+              <w:rPr>
+                <w:b/>
+                <w:bCs/>
+              </w:rPr>
+            </w:pPr>
+          </w:p>
+        </w:tc>
+        <w:tc>
+          <w:tcPr>
+            <w:tcW w:w="712" w:type="dxa"/>
+          </w:tcPr>
+          <w:p/>
+        </w:tc>
+        <w:tc>
+          <w:tcPr>
+            <w:tcW w:w="802" w:type="dxa"/>
+          </w:tcPr>
+          <w:p/>
+        </w:tc>
+      </w:tr>
+      <w:tr>
+        <w:tc>
+          <w:tcPr>
+            <w:tcW w:w="557" w:type="dxa"/>
+            <w:vMerge/>
+          </w:tcPr>
+          <w:p>
+            <w:pPr>
+              <w:jc w:val="center"/>
+            </w:pPr>
+          </w:p>
+        </w:tc>
+        <w:tc>
+          <w:tcPr>
+            <w:tcW w:w="1243" w:type="dxa"/>
+          </w:tcPr>
+          <w:p>
+            <w:pPr>
+              <w:jc w:val="center"/>
+            </w:pPr>
+            <w:r>
+              <w:t>100</w:t>
+            </w:r>
+          </w:p>
+        </w:tc>
+        <w:tc>
+          <w:tcPr>
+            <w:tcW w:w="883" w:type="dxa"/>
+          </w:tcPr>
+          <w:p/>
+        </w:tc>
+        <w:tc>
+          <w:tcPr>
+            <w:tcW w:w="883" w:type="dxa"/>
+          </w:tcPr>
+          <w:p/>
+        </w:tc>
+        <w:tc>
+          <w:tcPr>
+            <w:tcW w:w="712" w:type="dxa"/>
+          </w:tcPr>
+          <w:p/>
+        </w:tc>
+        <w:tc>
+          <w:tcPr>
+            <w:tcW w:w="802" w:type="dxa"/>
+          </w:tcPr>
+          <w:p/>
+        </w:tc>
+        <w:tc>
+          <w:tcPr>
+            <w:tcW w:w="883" w:type="dxa"/>
+          </w:tcPr>
+          <w:p>
+            <w:pPr>
+              <w:rPr>
+                <w:b/>
+                <w:bCs/>
+                <w:u w:val="single"/>
+              </w:rPr>
+            </w:pPr>
+          </w:p>
+        </w:tc>
+        <w:tc>
+          <w:tcPr>
+            <w:tcW w:w="883" w:type="dxa"/>
+          </w:tcPr>
+          <w:p/>
+        </w:tc>
+        <w:tc>
+          <w:tcPr>
+            <w:tcW w:w="990" w:type="dxa"/>
+          </w:tcPr>
+          <w:p>
+            <w:pPr>
+              <w:rPr>
+                <w:b/>
+                <w:bCs/>
+              </w:rPr>
+            </w:pPr>
+          </w:p>
+        </w:tc>
+        <w:tc>
+          <w:tcPr>
+            <w:tcW w:w="712" w:type="dxa"/>
+          </w:tcPr>
+          <w:p/>
+        </w:tc>
+        <w:tc>
+          <w:tcPr>
+            <w:tcW w:w="802" w:type="dxa"/>
+          </w:tcPr>
+          <w:p/>
+        </w:tc>
+      </w:tr>
+      <w:tr>
+        <w:tc>
+          <w:tcPr>
+            <w:tcW w:w="557" w:type="dxa"/>
+            <w:vMerge/>
+          </w:tcPr>
+          <w:p>
+            <w:pPr>
+              <w:jc w:val="center"/>
+            </w:pPr>
+          </w:p>
+        </w:tc>
+        <w:tc>
+          <w:tcPr>
+            <w:tcW w:w="1243" w:type="dxa"/>
+          </w:tcPr>
+          <w:p>
+            <w:pPr>
+              <w:jc w:val="center"/>
+            </w:pPr>
+            <w:r>
+              <w:t>200</w:t>
+            </w:r>
+          </w:p>
+        </w:tc>
+        <w:tc>
+          <w:tcPr>
+            <w:tcW w:w="883" w:type="dxa"/>
+          </w:tcPr>
+          <w:p/>
+        </w:tc>
+        <w:tc>
+          <w:tcPr>
+            <w:tcW w:w="883" w:type="dxa"/>
+          </w:tcPr>
+          <w:p/>
+        </w:tc>
+        <w:tc>
+          <w:tcPr>
+            <w:tcW w:w="712" w:type="dxa"/>
+          </w:tcPr>
+          <w:p/>
+        </w:tc>
+        <w:tc>
+          <w:tcPr>
+            <w:tcW w:w="802" w:type="dxa"/>
+          </w:tcPr>
+          <w:p/>
+        </w:tc>
+        <w:tc>
+          <w:tcPr>
+            <w:tcW w:w="883" w:type="dxa"/>
+          </w:tcPr>
+          <w:p>
+            <w:pPr>
+              <w:rPr>
+                <w:b/>
+                <w:bCs/>
+                <w:u w:val="single"/>
+              </w:rPr>
+            </w:pPr>
+          </w:p>
+        </w:tc>
+        <w:tc>
+          <w:tcPr>
+            <w:tcW w:w="883" w:type="dxa"/>
+          </w:tcPr>
+          <w:p/>
+        </w:tc>
+        <w:tc>
+          <w:tcPr>
+            <w:tcW w:w="990" w:type="dxa"/>
+          </w:tcPr>
+          <w:p>
+            <w:pPr>
+              <w:rPr>
+                <w:b/>
+                <w:bCs/>
+              </w:rPr>
+            </w:pPr>
+          </w:p>
+        </w:tc>
+        <w:tc>
+          <w:tcPr>
+            <w:tcW w:w="712" w:type="dxa"/>
+          </w:tcPr>
+          <w:p/>
+        </w:tc>
+        <w:tc>
+          <w:tcPr>
+            <w:tcW w:w="802" w:type="dxa"/>
+          </w:tcPr>
+          <w:p/>
         </w:tc>
       </w:tr>
     </w:tbl>

</xml_diff>

<commit_message>
add results with num workers statistics
</commit_message>
<xml_diff>
--- a/master-slave/evaluate-results/danh-gia-ket-qua-2.docx
+++ b/master-slave/evaluate-results/danh-gia-ket-qua-2.docx
@@ -7456,13 +7456,7 @@
         <w:rPr>
           <w:rFonts w:cs="Times New Roman"/>
         </w:rPr>
-        <w:t>µ</w:t>
-      </w:r>
-      <w:r>
-        <w:rPr>
-          <w:rFonts w:cs="Times New Roman"/>
-        </w:rPr>
-        <w:t>.</w:t>
+        <w:t>µ.</w:t>
       </w:r>
     </w:p>
     <w:p>
@@ -7563,10 +7557,7 @@
         <w:t>tuy nhiên</w:t>
       </w:r>
       <w:r>
-        <w:t xml:space="preserve"> CV </w:t>
-      </w:r>
-      <w:r>
-        <w:t>cao hơn</w:t>
+        <w:t xml:space="preserve"> CV cao hơn</w:t>
       </w:r>
       <w:r>
         <w:t xml:space="preserve"> một chút</w:t>
@@ -7575,16 +7566,7 @@
         <w:t xml:space="preserve"> và</w:t>
       </w:r>
       <w:r>
-        <w:t xml:space="preserve"> Time </w:t>
-      </w:r>
-      <w:r>
-        <w:t xml:space="preserve">chậm </w:t>
-      </w:r>
-      <w:r>
-        <w:t>hơn</w:t>
-      </w:r>
-      <w:r>
-        <w:t xml:space="preserve"> </w:t>
+        <w:t xml:space="preserve"> Time chậm hơn </w:t>
       </w:r>
       <w:r>
         <w:t>2</w:t>
@@ -7653,10 +7635,7 @@
         <w:t xml:space="preserve"> và vừa đủ tốt so với thuật toán tuần tự</w:t>
       </w:r>
       <w:r>
-        <w:t xml:space="preserve">. </w:t>
-      </w:r>
-      <w:r>
-        <w:t xml:space="preserve">Chọn chiến lược </w:t>
+        <w:t xml:space="preserve">. Chọn chiến lược </w:t>
       </w:r>
       <w:r>
         <w:rPr>
@@ -7863,10 +7842,7 @@
         <w:t>µ</w:t>
       </w:r>
       <w:r>
-        <w:t xml:space="preserve"> </w:t>
-      </w:r>
-      <w:r>
-        <w:t xml:space="preserve">= </w:t>
+        <w:t xml:space="preserve"> = </w:t>
       </w:r>
       <w:r>
         <w:t xml:space="preserve">11, 12, </w:t>
@@ -8109,19 +8085,7 @@
           <w:rFonts w:cs="Times New Roman"/>
         </w:rPr>
         <w:lastRenderedPageBreak/>
-        <w:t>µ</w:t>
-      </w:r>
-      <w:r>
-        <w:rPr>
-          <w:rFonts w:cs="Times New Roman"/>
-        </w:rPr>
-        <w:t xml:space="preserve"> =</w:t>
-      </w:r>
-      <w:r>
-        <w:rPr>
-          <w:rFonts w:cs="Times New Roman"/>
-        </w:rPr>
-        <w:t xml:space="preserve"> </w:t>
+        <w:t xml:space="preserve">µ = </w:t>
       </w:r>
       <w:r>
         <w:t>(2, 4, 6)</w:t>
@@ -11358,40 +11322,10 @@
         <w:rPr>
           <w:rFonts w:cs="Times New Roman"/>
         </w:rPr>
-        <w:t>µ</w:t>
-      </w:r>
-      <w:r>
-        <w:rPr>
-          <w:rFonts w:cs="Times New Roman"/>
-        </w:rPr>
-        <w:t xml:space="preserve"> =</w:t>
-      </w:r>
-      <w:r>
-        <w:rPr>
-          <w:rFonts w:cs="Times New Roman"/>
-        </w:rPr>
-        <w:t xml:space="preserve"> </w:t>
-      </w:r>
-      <w:r>
-        <w:t>(</w:t>
-      </w:r>
-      <w:r>
-        <w:t>8</w:t>
-      </w:r>
-      <w:r>
-        <w:t>,</w:t>
-      </w:r>
-      <w:r>
-        <w:t xml:space="preserve"> 10</w:t>
-      </w:r>
-      <w:r>
-        <w:t xml:space="preserve">, </w:t>
-      </w:r>
-      <w:r>
-        <w:t>11, 12</w:t>
-      </w:r>
-      <w:r>
-        <w:t>)</w:t>
+        <w:t xml:space="preserve">µ = </w:t>
+      </w:r>
+      <w:r>
+        <w:t>(8, 10, 11, 12)</w:t>
       </w:r>
     </w:p>
     <w:tbl>
@@ -14669,14 +14603,7 @@
                 <w:rFonts w:cs="Times New Roman"/>
                 <w:szCs w:val="24"/>
               </w:rPr>
-              <w:t>-</w:t>
-            </w:r>
-            <w:r>
-              <w:rPr>
-                <w:rFonts w:cs="Times New Roman"/>
-                <w:szCs w:val="24"/>
-              </w:rPr>
-              <w:t>1.</w:t>
+              <w:t>-1.</w:t>
             </w:r>
             <w:r>
               <w:rPr>
@@ -14794,14 +14721,7 @@
                 <w:rFonts w:cs="Times New Roman"/>
                 <w:szCs w:val="24"/>
               </w:rPr>
-              <w:t>-</w:t>
-            </w:r>
-            <w:r>
-              <w:rPr>
-                <w:rFonts w:cs="Times New Roman"/>
-                <w:szCs w:val="24"/>
-              </w:rPr>
-              <w:t>1.</w:t>
+              <w:t>-1.</w:t>
             </w:r>
             <w:r>
               <w:rPr>
@@ -14953,14 +14873,7 @@
                 <w:rFonts w:cs="Times New Roman"/>
                 <w:szCs w:val="24"/>
               </w:rPr>
-              <w:t>-</w:t>
-            </w:r>
-            <w:r>
-              <w:rPr>
-                <w:rFonts w:cs="Times New Roman"/>
-                <w:szCs w:val="24"/>
-              </w:rPr>
-              <w:t>1.</w:t>
+              <w:t>-1.</w:t>
             </w:r>
             <w:r>
               <w:rPr>
@@ -14982,14 +14895,7 @@
                 <w:rFonts w:cs="Times New Roman"/>
                 <w:szCs w:val="24"/>
               </w:rPr>
-              <w:t>-1</w:t>
-            </w:r>
-            <w:r>
-              <w:rPr>
-                <w:rFonts w:cs="Times New Roman"/>
-                <w:szCs w:val="24"/>
-              </w:rPr>
-              <w:t>.</w:t>
+              <w:t>-1.</w:t>
             </w:r>
             <w:r>
               <w:rPr>
@@ -15081,14 +14987,7 @@
                 <w:rFonts w:cs="Times New Roman"/>
                 <w:szCs w:val="24"/>
               </w:rPr>
-              <w:t>-1.</w:t>
-            </w:r>
-            <w:r>
-              <w:rPr>
-                <w:rFonts w:cs="Times New Roman"/>
-                <w:szCs w:val="24"/>
-              </w:rPr>
-              <w:t>6</w:t>
+              <w:t>-1.6</w:t>
             </w:r>
             <w:r>
               <w:rPr>
@@ -15692,7 +15591,7 @@
       </w:r>
       <w:r>
         <w:tab/>
-        <w:t>Từ các tham số, chiến lược đã lựa chọn ở trên và chọn rank làm chiến lược pull elite, tiến hành biểu diễn lại độ hội tụ của chất lượng nghiệm theo thời gian chạy chương trình với các min-pull-elites-per-worker-factor (</w:t>
+        <w:t>Từ các tham số, chiến lược đã lựa chọn ở trên, tiến hành biểu diễn lại độ hội tụ của chất lượng nghiệm theo thời gian chạy chương trình với các min-pull-elites-per-worker-factor (</w:t>
       </w:r>
       <w:r>
         <w:rPr>
@@ -15707,76 +15606,18 @@
     <w:p>
       <w:r>
         <w:tab/>
-        <w:t>Chọn 1 file (200.40.2.txt) trong bộ dữ liệu của Customers = 200 để chạy thực nghiệm.</w:t>
+        <w:t>Chọn</w:t>
+      </w:r>
+      <w:r>
+        <w:t xml:space="preserve"> instance 200.40.4 </w:t>
+      </w:r>
+      <w:r>
+        <w:t>trong bộ dữ liệu của Customers = 200 để chạy thực nghiệm.</w:t>
       </w:r>
     </w:p>
     <w:p>
       <w:r>
         <w:t>=&gt; Nhận xét:</w:t>
-      </w:r>
-    </w:p>
-    <w:p>
-      <w:r>
-        <w:tab/>
-        <w:t xml:space="preserve">- Trong mọi </w:t>
-      </w:r>
-      <w:r>
-        <w:rPr>
-          <w:rFonts w:cs="Times New Roman"/>
-        </w:rPr>
-        <w:t>µ, c</w:t>
-      </w:r>
-      <w:r>
-        <w:t>ost giảm rất nhanh trong 1–3 giây đầu, sau đó gãy khúc rồi dần phẳng.</w:t>
-      </w:r>
-    </w:p>
-    <w:p>
-      <w:r>
-        <w:tab/>
-        <w:t xml:space="preserve">- Từ </w:t>
-      </w:r>
-      <w:r>
-        <w:rPr>
-          <w:rFonts w:cs="Times New Roman"/>
-        </w:rPr>
-        <w:t xml:space="preserve">µ </w:t>
-      </w:r>
-      <w:r>
-        <w:t xml:space="preserve">thấp lên trung bình (2 ~&gt; 4 ~&gt; 6) còn thấy được nhiều đơn vị cost giảm. Từ </w:t>
-      </w:r>
-      <w:r>
-        <w:rPr>
-          <w:rFonts w:cs="Times New Roman"/>
-        </w:rPr>
-        <w:t xml:space="preserve">µ </w:t>
-      </w:r>
-      <w:r>
-        <w:t>trung bình lên cao (8 ~&gt; 10) đường cong gần như đã phẳng, cải thiện thêm rất ít so với thời gian tăng khá nhiều.</w:t>
-      </w:r>
-    </w:p>
-    <w:p>
-      <w:r>
-        <w:lastRenderedPageBreak/>
-        <w:tab/>
-        <w:t xml:space="preserve">- </w:t>
-      </w:r>
-      <w:r>
-        <w:rPr>
-          <w:rFonts w:cs="Times New Roman"/>
-        </w:rPr>
-        <w:t xml:space="preserve">µ </w:t>
-      </w:r>
-      <w:r>
-        <w:t xml:space="preserve">tầm trung (4–6) là điểm trade‑off tốt, đạt gần mức nghiệm tốt nhất mà vẫn không tốn quá nhiều thời gian. Các mức </w:t>
-      </w:r>
-      <w:r>
-        <w:rPr>
-          <w:rFonts w:cs="Times New Roman"/>
-        </w:rPr>
-        <w:t xml:space="preserve">µ </w:t>
-      </w:r>
-      <w:r>
-        <w:t>lớn hơn (8–10) thích hợp khi cần nghiệm tốt nhất có thể và thời gian không phải vấn đề.</w:t>
       </w:r>
     </w:p>
     <w:p>
@@ -15784,45 +15625,102 @@
         <w:pStyle w:val="ListParagraph"/>
         <w:numPr>
           <w:ilvl w:val="0"/>
-          <w:numId w:val="5"/>
+          <w:numId w:val="7"/>
+        </w:numPr>
+      </w:pPr>
+      <w:r>
+        <w:t>Biểu đồ hội tụ đều có dạng hàm mũ giảm đặc trưng: cost giảm rất nhanh trong 2-3 giây đầu khi không gian tìm kiếm còn rộng, sau đó chậm dần và tiệm cận về giá trị tối ưu cục bộ.</w:t>
+      </w:r>
+    </w:p>
+    <w:p>
+      <w:pPr>
+        <w:pStyle w:val="ListParagraph"/>
+        <w:numPr>
+          <w:ilvl w:val="0"/>
+          <w:numId w:val="7"/>
+        </w:numPr>
+      </w:pPr>
+      <w:r>
+        <w:t>Biểu đồ số lượng elite tìm được theo từng giây cho thấy hơn 80% elite đưuọc phát hiện trong 3 giây đầu.</w:t>
+      </w:r>
+    </w:p>
+    <w:p>
+      <w:pPr>
+        <w:pStyle w:val="ListParagraph"/>
+        <w:numPr>
+          <w:ilvl w:val="0"/>
+          <w:numId w:val="7"/>
         </w:numPr>
       </w:pPr>
       <w:r>
         <w:rPr>
           <w:rFonts w:cs="Times New Roman"/>
         </w:rPr>
-        <w:t>µ = 2:</w:t>
+        <w:t xml:space="preserve">µ = </w:t>
+      </w:r>
+      <w:r>
+        <w:rPr>
+          <w:rFonts w:cs="Times New Roman"/>
+        </w:rPr>
+        <w:t>12 có</w:t>
+      </w:r>
+      <w:r>
+        <w:rPr>
+          <w:rFonts w:cs="Times New Roman"/>
+        </w:rPr>
+        <w:t xml:space="preserve"> tổng</w:t>
+      </w:r>
+      <w:r>
+        <w:rPr>
+          <w:rFonts w:cs="Times New Roman"/>
+        </w:rPr>
+        <w:t xml:space="preserve"> số lượng elite được tìm thấy nhiều hơn</w:t>
+      </w:r>
+      <w:r>
+        <w:rPr>
+          <w:rFonts w:cs="Times New Roman"/>
+        </w:rPr>
+        <w:t xml:space="preserve"> và kéo dài khả năng thoát khỏi cực tiểu cục bộ trong quá trình chạy lâu hơn.</w:t>
+      </w:r>
+    </w:p>
+    <w:p/>
+    <w:p>
+      <w:r>
+        <w:rPr>
+          <w:rFonts w:cs="Times New Roman"/>
+        </w:rPr>
+        <w:lastRenderedPageBreak/>
+        <w:t xml:space="preserve">µ = </w:t>
+      </w:r>
+      <w:r>
+        <w:rPr>
+          <w:rFonts w:cs="Times New Roman"/>
+        </w:rPr>
+        <w:t>6 (</w:t>
+      </w:r>
+      <w:r>
+        <w:rPr>
+          <w:rFonts w:cs="Times New Roman"/>
+        </w:rPr>
+        <w:t>topk làm chiến lược pull elite và có đa dạng tham số chấm điểm</w:t>
+      </w:r>
+      <w:r>
+        <w:rPr>
+          <w:rFonts w:cs="Times New Roman"/>
+        </w:rPr>
+        <w:t>)</w:t>
       </w:r>
     </w:p>
     <w:p>
-      <w:pPr>
-        <w:ind w:left="720"/>
-      </w:pPr>
-      <w:r>
-        <w:t>Thời gian chạy: 12394.0 ms</w:t>
-      </w:r>
-    </w:p>
-    <w:p>
-      <w:pPr>
-        <w:ind w:left="720"/>
-      </w:pPr>
-      <w:r>
-        <w:t>Nghiệm cuối cùng tìm được tại: 11935.5 ms</w:t>
-      </w:r>
-    </w:p>
-    <w:p>
-      <w:pPr>
-        <w:jc w:val="center"/>
-      </w:pPr>
       <w:r>
         <w:rPr>
           <w:noProof/>
         </w:rPr>
         <w:drawing>
-          <wp:inline distT="0" distB="0" distL="0" distR="0">
+          <wp:inline distT="0" distB="0" distL="0" distR="0" wp14:anchorId="4F93B5C7" wp14:editId="1208F71C">
             <wp:extent cx="5943600" cy="2971800"/>
             <wp:effectExtent l="0" t="0" r="0" b="0"/>
-            <wp:docPr id="7" name="Picture 7"/>
+            <wp:docPr id="8" name="Picture 8"/>
             <wp:cNvGraphicFramePr>
               <a:graphicFrameLocks xmlns:a="http://schemas.openxmlformats.org/drawingml/2006/main" noChangeAspect="1"/>
             </wp:cNvGraphicFramePr>
@@ -15830,10 +15728,8 @@
               <a:graphicData uri="http://schemas.openxmlformats.org/drawingml/2006/picture">
                 <pic:pic xmlns:pic="http://schemas.openxmlformats.org/drawingml/2006/picture">
                   <pic:nvPicPr>
-                    <pic:cNvPr id="7" name="Picture 7"/>
-                    <pic:cNvPicPr>
-                      <a:picLocks noChangeAspect="1" noChangeArrowheads="1"/>
-                    </pic:cNvPicPr>
+                    <pic:cNvPr id="8" name="Picture 8"/>
+                    <pic:cNvPicPr/>
                   </pic:nvPicPr>
                   <pic:blipFill>
                     <a:blip r:embed="rId7" cstate="print">
@@ -15843,7 +15739,6 @@
                         </a:ext>
                       </a:extLst>
                     </a:blip>
-                    <a:srcRect/>
                     <a:stretch>
                       <a:fillRect/>
                     </a:stretch>
@@ -15856,10 +15751,6 @@
                     <a:prstGeom prst="rect">
                       <a:avLst/>
                     </a:prstGeom>
-                    <a:noFill/>
-                    <a:ln>
-                      <a:noFill/>
-                    </a:ln>
                   </pic:spPr>
                 </pic:pic>
               </a:graphicData>
@@ -15869,50 +15760,15 @@
       </w:r>
     </w:p>
     <w:p>
-      <w:pPr>
-        <w:pStyle w:val="ListParagraph"/>
-        <w:numPr>
-          <w:ilvl w:val="0"/>
-          <w:numId w:val="5"/>
-        </w:numPr>
-      </w:pPr>
-      <w:r>
-        <w:rPr>
-          <w:rFonts w:cs="Times New Roman"/>
-        </w:rPr>
-        <w:t>µ = 4:</w:t>
-      </w:r>
-    </w:p>
-    <w:p>
-      <w:pPr>
-        <w:ind w:left="720"/>
-      </w:pPr>
-      <w:r>
-        <w:t>Thời gian chạy: 15768.0 ms</w:t>
-      </w:r>
-    </w:p>
-    <w:p>
-      <w:pPr>
-        <w:ind w:left="720"/>
-      </w:pPr>
-      <w:r>
-        <w:t>Nghiệm cuối cùng tìm được tại: 15119.8 ms</w:t>
-      </w:r>
-    </w:p>
-    <w:p>
-      <w:pPr>
-        <w:jc w:val="center"/>
-      </w:pPr>
       <w:r>
         <w:rPr>
           <w:noProof/>
         </w:rPr>
-        <w:lastRenderedPageBreak/>
         <w:drawing>
-          <wp:inline distT="0" distB="0" distL="0" distR="0">
+          <wp:inline distT="0" distB="0" distL="0" distR="0" wp14:anchorId="24503986" wp14:editId="44A7DDD4">
             <wp:extent cx="5943600" cy="2971800"/>
             <wp:effectExtent l="0" t="0" r="0" b="0"/>
-            <wp:docPr id="3" name="Picture 3"/>
+            <wp:docPr id="10" name="Picture 10"/>
             <wp:cNvGraphicFramePr>
               <a:graphicFrameLocks xmlns:a="http://schemas.openxmlformats.org/drawingml/2006/main" noChangeAspect="1"/>
             </wp:cNvGraphicFramePr>
@@ -15920,10 +15776,8 @@
               <a:graphicData uri="http://schemas.openxmlformats.org/drawingml/2006/picture">
                 <pic:pic xmlns:pic="http://schemas.openxmlformats.org/drawingml/2006/picture">
                   <pic:nvPicPr>
-                    <pic:cNvPr id="3" name="Picture 3"/>
-                    <pic:cNvPicPr>
-                      <a:picLocks noChangeAspect="1" noChangeArrowheads="1"/>
-                    </pic:cNvPicPr>
+                    <pic:cNvPr id="10" name="Picture 10"/>
+                    <pic:cNvPicPr/>
                   </pic:nvPicPr>
                   <pic:blipFill>
                     <a:blip r:embed="rId8" cstate="print">
@@ -15933,7 +15787,6 @@
                         </a:ext>
                       </a:extLst>
                     </a:blip>
-                    <a:srcRect/>
                     <a:stretch>
                       <a:fillRect/>
                     </a:stretch>
@@ -15946,10 +15799,6 @@
                     <a:prstGeom prst="rect">
                       <a:avLst/>
                     </a:prstGeom>
-                    <a:noFill/>
-                    <a:ln>
-                      <a:noFill/>
-                    </a:ln>
                   </pic:spPr>
                 </pic:pic>
               </a:graphicData>
@@ -15960,48 +15809,42 @@
     </w:p>
     <w:p>
       <w:pPr>
-        <w:pStyle w:val="ListParagraph"/>
-        <w:numPr>
-          <w:ilvl w:val="0"/>
-          <w:numId w:val="5"/>
-        </w:numPr>
-      </w:pPr>
-      <w:r>
         <w:rPr>
           <w:rFonts w:cs="Times New Roman"/>
         </w:rPr>
-        <w:t>µ = 6:</w:t>
-      </w:r>
+      </w:pPr>
     </w:p>
     <w:p>
-      <w:pPr>
-        <w:ind w:left="720"/>
-      </w:pPr>
-      <w:r>
-        <w:t>Thời gian chạy: 16318.4 ms</w:t>
+      <w:r>
+        <w:rPr>
+          <w:rFonts w:cs="Times New Roman"/>
+        </w:rPr>
+        <w:t>µ = 12</w:t>
+      </w:r>
+      <w:r>
+        <w:t xml:space="preserve"> (</w:t>
+      </w:r>
+      <w:r>
+        <w:rPr>
+          <w:rFonts w:cs="Times New Roman"/>
+        </w:rPr>
+        <w:t>rank làm chiến lược pull elite và cố định tham số chấm điểm</w:t>
+      </w:r>
+      <w:r>
+        <w:t>)</w:t>
       </w:r>
     </w:p>
     <w:p>
-      <w:pPr>
-        <w:ind w:left="720"/>
-      </w:pPr>
-      <w:r>
-        <w:t>Nghiệm cuối cùng tìm được tại: 15200.9 ms</w:t>
-      </w:r>
-    </w:p>
-    <w:p>
-      <w:pPr>
-        <w:jc w:val="center"/>
-      </w:pPr>
       <w:r>
         <w:rPr>
           <w:noProof/>
         </w:rPr>
+        <w:lastRenderedPageBreak/>
         <w:drawing>
-          <wp:inline distT="0" distB="0" distL="0" distR="0">
+          <wp:inline distT="0" distB="0" distL="0" distR="0" wp14:anchorId="7D844DBB" wp14:editId="56F948B5">
             <wp:extent cx="5943600" cy="2971800"/>
             <wp:effectExtent l="0" t="0" r="0" b="0"/>
-            <wp:docPr id="9" name="Picture 9"/>
+            <wp:docPr id="11" name="Picture 11"/>
             <wp:cNvGraphicFramePr>
               <a:graphicFrameLocks xmlns:a="http://schemas.openxmlformats.org/drawingml/2006/main" noChangeAspect="1"/>
             </wp:cNvGraphicFramePr>
@@ -16009,10 +15852,8 @@
               <a:graphicData uri="http://schemas.openxmlformats.org/drawingml/2006/picture">
                 <pic:pic xmlns:pic="http://schemas.openxmlformats.org/drawingml/2006/picture">
                   <pic:nvPicPr>
-                    <pic:cNvPr id="9" name="Picture 9"/>
-                    <pic:cNvPicPr>
-                      <a:picLocks noChangeAspect="1" noChangeArrowheads="1"/>
-                    </pic:cNvPicPr>
+                    <pic:cNvPr id="11" name="Picture 11"/>
+                    <pic:cNvPicPr/>
                   </pic:nvPicPr>
                   <pic:blipFill>
                     <a:blip r:embed="rId9" cstate="print">
@@ -16022,7 +15863,6 @@
                         </a:ext>
                       </a:extLst>
                     </a:blip>
-                    <a:srcRect/>
                     <a:stretch>
                       <a:fillRect/>
                     </a:stretch>
@@ -16035,10 +15875,6 @@
                     <a:prstGeom prst="rect">
                       <a:avLst/>
                     </a:prstGeom>
-                    <a:noFill/>
-                    <a:ln>
-                      <a:noFill/>
-                    </a:ln>
                   </pic:spPr>
                 </pic:pic>
               </a:graphicData>
@@ -16048,50 +15884,15 @@
       </w:r>
     </w:p>
     <w:p>
-      <w:pPr>
-        <w:pStyle w:val="ListParagraph"/>
-        <w:numPr>
-          <w:ilvl w:val="0"/>
-          <w:numId w:val="5"/>
-        </w:numPr>
-      </w:pPr>
-      <w:r>
-        <w:rPr>
-          <w:rFonts w:cs="Times New Roman"/>
-        </w:rPr>
-        <w:t>µ = 8:</w:t>
-      </w:r>
-    </w:p>
-    <w:p>
-      <w:pPr>
-        <w:ind w:left="720"/>
-      </w:pPr>
-      <w:r>
-        <w:t>Thời gian chạy: 22366.0 ms</w:t>
-      </w:r>
-    </w:p>
-    <w:p>
-      <w:pPr>
-        <w:ind w:left="720"/>
-      </w:pPr>
-      <w:r>
-        <w:t>Nghiệm cuối cùng tìm được tại: 18603.9 ms</w:t>
-      </w:r>
-    </w:p>
-    <w:p>
-      <w:pPr>
-        <w:jc w:val="center"/>
-      </w:pPr>
       <w:r>
         <w:rPr>
           <w:noProof/>
         </w:rPr>
-        <w:lastRenderedPageBreak/>
         <w:drawing>
-          <wp:inline distT="0" distB="0" distL="0" distR="0">
+          <wp:inline distT="0" distB="0" distL="0" distR="0" wp14:anchorId="63A860B3" wp14:editId="4D12C86D">
             <wp:extent cx="5943600" cy="2971800"/>
             <wp:effectExtent l="0" t="0" r="0" b="0"/>
-            <wp:docPr id="5" name="Picture 5"/>
+            <wp:docPr id="12" name="Picture 12"/>
             <wp:cNvGraphicFramePr>
               <a:graphicFrameLocks xmlns:a="http://schemas.openxmlformats.org/drawingml/2006/main" noChangeAspect="1"/>
             </wp:cNvGraphicFramePr>
@@ -16099,10 +15900,8 @@
               <a:graphicData uri="http://schemas.openxmlformats.org/drawingml/2006/picture">
                 <pic:pic xmlns:pic="http://schemas.openxmlformats.org/drawingml/2006/picture">
                   <pic:nvPicPr>
-                    <pic:cNvPr id="5" name="Picture 5"/>
-                    <pic:cNvPicPr>
-                      <a:picLocks noChangeAspect="1" noChangeArrowheads="1"/>
-                    </pic:cNvPicPr>
+                    <pic:cNvPr id="12" name="Picture 12"/>
+                    <pic:cNvPicPr/>
                   </pic:nvPicPr>
                   <pic:blipFill>
                     <a:blip r:embed="rId10" cstate="print">
@@ -16112,7 +15911,6 @@
                         </a:ext>
                       </a:extLst>
                     </a:blip>
-                    <a:srcRect/>
                     <a:stretch>
                       <a:fillRect/>
                     </a:stretch>
@@ -16125,10 +15923,6 @@
                     <a:prstGeom prst="rect">
                       <a:avLst/>
                     </a:prstGeom>
-                    <a:noFill/>
-                    <a:ln>
-                      <a:noFill/>
-                    </a:ln>
                   </pic:spPr>
                 </pic:pic>
               </a:graphicData>
@@ -16139,48 +15933,174 @@
     </w:p>
     <w:p>
       <w:pPr>
+        <w:pStyle w:val="Heading1"/>
+      </w:pPr>
+      <w:r>
+        <w:t>5</w:t>
+      </w:r>
+      <w:r>
+        <w:t>. Ảnh hưởng của số lượng worker</w:t>
+      </w:r>
+    </w:p>
+    <w:p>
+      <w:r>
+        <w:tab/>
+        <w:t>Từ các tham số, chiến lược đã được lựa chọn ở trên, tiền hành chạy chương trình với số lượng worker =</w:t>
+      </w:r>
+      <w:r>
+        <w:t xml:space="preserve"> 3</w:t>
+      </w:r>
+      <w:r>
+        <w:t xml:space="preserve"> ~&gt;</w:t>
+      </w:r>
+      <w:r>
+        <w:t xml:space="preserve"> 9 </w:t>
+      </w:r>
+      <w:r>
+        <w:rPr>
+          <w:rFonts w:cs="Times New Roman"/>
+        </w:rPr>
+        <w:t>rồi</w:t>
+      </w:r>
+      <w:r>
+        <w:t xml:space="preserve"> so sánh với baseline tuần tự trên Customers</w:t>
+      </w:r>
+      <w:r>
+        <w:t xml:space="preserve"> = 200</w:t>
+      </w:r>
+      <w:r>
+        <w:t xml:space="preserve">. Trong đó: </w:t>
+      </w:r>
+      <w:r>
+        <w:rPr>
+          <w:rFonts w:cs="Times New Roman"/>
+        </w:rPr>
+        <w:t xml:space="preserve">µ = </w:t>
+      </w:r>
+      <w:r>
+        <w:rPr>
+          <w:rFonts w:cs="Times New Roman"/>
+        </w:rPr>
+        <w:t>6</w:t>
+      </w:r>
+      <w:r>
+        <w:rPr>
+          <w:rFonts w:cs="Times New Roman"/>
+        </w:rPr>
+        <w:t xml:space="preserve"> chọn </w:t>
+      </w:r>
+      <w:r>
+        <w:rPr>
+          <w:rFonts w:cs="Times New Roman"/>
+        </w:rPr>
+        <w:t>top</w:t>
+      </w:r>
+      <w:r>
+        <w:rPr>
+          <w:rFonts w:cs="Times New Roman"/>
+        </w:rPr>
+        <w:t>k làm chiến lược pull elite</w:t>
+      </w:r>
+      <w:r>
+        <w:rPr>
+          <w:rFonts w:cs="Times New Roman"/>
+        </w:rPr>
+        <w:t xml:space="preserve"> và có đa dạng tham số chấm điểm; </w:t>
+      </w:r>
+      <w:r>
+        <w:rPr>
+          <w:rFonts w:cs="Times New Roman"/>
+        </w:rPr>
+        <w:t xml:space="preserve">µ = </w:t>
+      </w:r>
+      <w:r>
+        <w:rPr>
+          <w:rFonts w:cs="Times New Roman"/>
+        </w:rPr>
+        <w:t>12</w:t>
+      </w:r>
+      <w:r>
+        <w:rPr>
+          <w:rFonts w:cs="Times New Roman"/>
+        </w:rPr>
+        <w:t xml:space="preserve"> chọn rank làm chiến lược pull elite</w:t>
+      </w:r>
+      <w:r>
+        <w:rPr>
+          <w:rFonts w:cs="Times New Roman"/>
+        </w:rPr>
+        <w:t xml:space="preserve"> và cố định tham số chấm điểm</w:t>
+      </w:r>
+      <w:r>
+        <w:rPr>
+          <w:rFonts w:cs="Times New Roman"/>
+        </w:rPr>
+        <w:t>.</w:t>
+      </w:r>
+    </w:p>
+    <w:p>
+      <w:r>
+        <w:t>=&gt; Nhận xét:</w:t>
+      </w:r>
+    </w:p>
+    <w:p>
+      <w:pPr>
         <w:pStyle w:val="ListParagraph"/>
         <w:numPr>
           <w:ilvl w:val="0"/>
-          <w:numId w:val="5"/>
+          <w:numId w:val="6"/>
         </w:numPr>
       </w:pPr>
+      <w:r>
+        <w:t>Kết quả</w:t>
+      </w:r>
+      <w:r>
+        <w:t xml:space="preserve"> Best, Avg</w:t>
+      </w:r>
+      <w:r>
+        <w:t xml:space="preserve"> có xu hướng tốt dần khi tăng số lượng worker do càng nhiều worker thì độ đa dạng càng cao.</w:t>
+      </w:r>
+    </w:p>
+    <w:p>
+      <w:pPr>
+        <w:pStyle w:val="ListParagraph"/>
+        <w:numPr>
+          <w:ilvl w:val="0"/>
+          <w:numId w:val="6"/>
+        </w:numPr>
+      </w:pPr>
+      <w:r>
+        <w:lastRenderedPageBreak/>
+        <w:t xml:space="preserve">Thời gian chạy </w:t>
+      </w:r>
+      <w:r>
+        <w:t>biến thiên mạnh khi số lượng worker còn nhỏ, sau đó hội tụ về một vùng ổn định khi số worker vượt qua một ngưỡng nhất định.</w:t>
+      </w:r>
+    </w:p>
+    <w:p>
       <w:r>
         <w:rPr>
           <w:rFonts w:cs="Times New Roman"/>
         </w:rPr>
-        <w:t>µ = 10:</w:t>
+        <w:t xml:space="preserve">µ = </w:t>
+      </w:r>
+      <w:r>
+        <w:rPr>
+          <w:rFonts w:cs="Times New Roman"/>
+        </w:rPr>
+        <w:t>6</w:t>
       </w:r>
     </w:p>
     <w:p>
-      <w:pPr>
-        <w:ind w:left="720"/>
-      </w:pPr>
-      <w:r>
-        <w:t>Thời gian chạy: 24360.0 ms</w:t>
-      </w:r>
-    </w:p>
-    <w:p>
-      <w:pPr>
-        <w:ind w:left="720"/>
-      </w:pPr>
-      <w:r>
-        <w:t>Nghiệm cuối cùng tìm được tại: 22407.8 ms</w:t>
-      </w:r>
-    </w:p>
-    <w:p>
-      <w:pPr>
-        <w:jc w:val="center"/>
-      </w:pPr>
       <w:r>
         <w:rPr>
           <w:noProof/>
         </w:rPr>
         <w:drawing>
-          <wp:inline distT="0" distB="0" distL="0" distR="0">
-            <wp:extent cx="5943600" cy="2971800"/>
+          <wp:inline distT="0" distB="0" distL="0" distR="0" wp14:anchorId="0AC88CB1" wp14:editId="58B0510D">
+            <wp:extent cx="5943600" cy="2656840"/>
             <wp:effectExtent l="0" t="0" r="0" b="0"/>
-            <wp:docPr id="6" name="Picture 6"/>
+            <wp:docPr id="2" name="Picture 2"/>
             <wp:cNvGraphicFramePr>
               <a:graphicFrameLocks xmlns:a="http://schemas.openxmlformats.org/drawingml/2006/main" noChangeAspect="1"/>
             </wp:cNvGraphicFramePr>
@@ -16188,10 +16108,8 @@
               <a:graphicData uri="http://schemas.openxmlformats.org/drawingml/2006/picture">
                 <pic:pic xmlns:pic="http://schemas.openxmlformats.org/drawingml/2006/picture">
                   <pic:nvPicPr>
-                    <pic:cNvPr id="6" name="Picture 6"/>
-                    <pic:cNvPicPr>
-                      <a:picLocks noChangeAspect="1" noChangeArrowheads="1"/>
-                    </pic:cNvPicPr>
+                    <pic:cNvPr id="2" name="Picture 2"/>
+                    <pic:cNvPicPr/>
                   </pic:nvPicPr>
                   <pic:blipFill>
                     <a:blip r:embed="rId11" cstate="print">
@@ -16201,7 +16119,6 @@
                         </a:ext>
                       </a:extLst>
                     </a:blip>
-                    <a:srcRect/>
                     <a:stretch>
                       <a:fillRect/>
                     </a:stretch>
@@ -16209,15 +16126,11 @@
                   <pic:spPr>
                     <a:xfrm>
                       <a:off x="0" y="0"/>
-                      <a:ext cx="5943600" cy="2971800"/>
+                      <a:ext cx="5943600" cy="2656840"/>
                     </a:xfrm>
                     <a:prstGeom prst="rect">
                       <a:avLst/>
                     </a:prstGeom>
-                    <a:noFill/>
-                    <a:ln>
-                      <a:noFill/>
-                    </a:ln>
                   </pic:spPr>
                 </pic:pic>
               </a:graphicData>
@@ -16227,692 +16140,65 @@
       </w:r>
     </w:p>
     <w:p>
-      <w:pPr>
-        <w:pStyle w:val="Heading1"/>
-      </w:pPr>
-      <w:r>
-        <w:t>5</w:t>
-      </w:r>
-      <w:r>
-        <w:t>. Ảnh hưởng của số lượng worker</w:t>
-      </w:r>
-    </w:p>
-    <w:p>
-      <w:r>
-        <w:tab/>
-      </w:r>
-      <w:r>
-        <w:t>Từ các tham số, chiến lược đã được lựa chọn ở trên, tiền hành chạy chương trình với số lượng worker =</w:t>
-      </w:r>
-      <w:r>
-        <w:t xml:space="preserve"> 5,</w:t>
-      </w:r>
-      <w:r>
-        <w:t xml:space="preserve"> </w:t>
-      </w:r>
-      <w:r>
-        <w:t xml:space="preserve">6, 7, 8, </w:t>
-      </w:r>
-      <w:r>
-        <w:t xml:space="preserve">9 </w:t>
-      </w:r>
       <w:r>
         <w:rPr>
           <w:rFonts w:cs="Times New Roman"/>
         </w:rPr>
-        <w:t>rồi</w:t>
-      </w:r>
-      <w:r>
-        <w:t xml:space="preserve"> so sánh với baseline tuần tự trên Customers</w:t>
-      </w:r>
-      <w:r>
-        <w:t xml:space="preserve"> = 200</w:t>
-      </w:r>
-      <w:r>
-        <w:t xml:space="preserve">. Trong đó: </w:t>
+        <w:t>µ = 1</w:t>
       </w:r>
       <w:r>
         <w:rPr>
           <w:rFonts w:cs="Times New Roman"/>
         </w:rPr>
-        <w:t xml:space="preserve">µ = </w:t>
-      </w:r>
-      <w:r>
-        <w:rPr>
-          <w:rFonts w:cs="Times New Roman"/>
-        </w:rPr>
-        <w:t>4</w:t>
-      </w:r>
-      <w:r>
-        <w:rPr>
-          <w:rFonts w:cs="Times New Roman"/>
-        </w:rPr>
-        <w:t xml:space="preserve"> chọn </w:t>
-      </w:r>
-      <w:r>
-        <w:rPr>
-          <w:rFonts w:cs="Times New Roman"/>
-        </w:rPr>
-        <w:t>ran</w:t>
-      </w:r>
-      <w:r>
-        <w:rPr>
-          <w:rFonts w:cs="Times New Roman"/>
-        </w:rPr>
-        <w:t>k làm chiến lược pull elite.</w:t>
+        <w:t>2</w:t>
       </w:r>
     </w:p>
     <w:p>
       <w:r>
-        <w:lastRenderedPageBreak/>
-        <w:t>=&gt; Nhận xét:</w:t>
-      </w:r>
-    </w:p>
-    <w:p>
-      <w:pPr>
-        <w:pStyle w:val="ListParagraph"/>
-        <w:numPr>
-          <w:ilvl w:val="0"/>
-          <w:numId w:val="6"/>
-        </w:numPr>
-      </w:pPr>
-      <w:r>
-        <w:t>Kết quả có xu hướng tốt dần khi tăng số lượng worker do càng nhiều worker thì độ đa dạng càng cao.</w:t>
-      </w:r>
-    </w:p>
-    <w:p>
-      <w:pPr>
-        <w:pStyle w:val="ListParagraph"/>
-        <w:numPr>
-          <w:ilvl w:val="0"/>
-          <w:numId w:val="6"/>
-        </w:numPr>
-      </w:pPr>
-      <w:r>
-        <w:t>Thời gian chạy tăng dần khi tăng số worker</w:t>
-      </w:r>
-      <w:r>
-        <w:t xml:space="preserve"> mặc dù theo công thức tính số lượng pull tối thiểu của worker, worker càng ít thì mỗi worker càng phải pull nhiều hơn. Vì: </w:t>
-      </w:r>
-      <w:r>
-        <w:t>Số lượng worker ít ~&gt; độ đa dạng</w:t>
-      </w:r>
-      <w:r>
-        <w:t xml:space="preserve"> nghiệm</w:t>
-      </w:r>
-      <w:r>
-        <w:t xml:space="preserve"> thấp</w:t>
-      </w:r>
-      <w:r>
-        <w:t xml:space="preserve"> </w:t>
-      </w:r>
-      <w:r>
-        <w:t>~&gt; tốc độ pull elite nhanh hơn ~&gt; thời gian chạy nhanh hơn.</w:t>
-      </w:r>
-    </w:p>
-    <w:p>
-      <w:pPr>
-        <w:pStyle w:val="ListParagraph"/>
-        <w:numPr>
-          <w:ilvl w:val="0"/>
-          <w:numId w:val="6"/>
-        </w:numPr>
-      </w:pPr>
-      <w:r>
-        <w:t xml:space="preserve">Có thể tăng số lượng worker để có kết quả tốt hơn thay vì tăng </w:t>
-      </w:r>
-      <w:r>
         <w:rPr>
-          <w:rFonts w:cs="Times New Roman"/>
+          <w:noProof/>
         </w:rPr>
-        <w:t>µ, trong khi thời gian chạy khi thêm worker tăng chậm hơn so với nâng µ</w:t>
-      </w:r>
-    </w:p>
-    <w:tbl>
-      <w:tblPr>
-        <w:tblStyle w:val="TableGrid"/>
-        <w:tblW w:w="0" w:type="auto"/>
-        <w:tblLook w:val="04A0" w:firstRow="1" w:lastRow="0" w:firstColumn="1" w:lastColumn="0" w:noHBand="0" w:noVBand="1"/>
-      </w:tblPr>
-      <w:tblGrid>
-        <w:gridCol w:w="1168"/>
-        <w:gridCol w:w="1168"/>
-        <w:gridCol w:w="1169"/>
-        <w:gridCol w:w="1169"/>
-        <w:gridCol w:w="1169"/>
-        <w:gridCol w:w="1169"/>
-        <w:gridCol w:w="1169"/>
-        <w:gridCol w:w="1169"/>
-      </w:tblGrid>
-      <w:tr>
-        <w:tc>
-          <w:tcPr>
-            <w:tcW w:w="1168" w:type="dxa"/>
-          </w:tcPr>
-          <w:p>
-            <w:pPr>
-              <w:jc w:val="center"/>
-              <w:rPr>
-                <w:szCs w:val="24"/>
-              </w:rPr>
-            </w:pPr>
-            <w:r>
-              <w:rPr>
-                <w:szCs w:val="24"/>
-              </w:rPr>
-              <w:t>Số lượng worker</w:t>
-            </w:r>
-          </w:p>
-        </w:tc>
-        <w:tc>
-          <w:tcPr>
-            <w:tcW w:w="1168" w:type="dxa"/>
-          </w:tcPr>
-          <w:p>
-            <w:pPr>
-              <w:jc w:val="center"/>
-              <w:rPr>
-                <w:szCs w:val="24"/>
-              </w:rPr>
-            </w:pPr>
-            <w:r>
-              <w:rPr>
-                <w:szCs w:val="24"/>
-              </w:rPr>
-              <w:t>Best</w:t>
-            </w:r>
-          </w:p>
-        </w:tc>
-        <w:tc>
-          <w:tcPr>
-            <w:tcW w:w="1169" w:type="dxa"/>
-          </w:tcPr>
-          <w:p>
-            <w:pPr>
-              <w:jc w:val="center"/>
-              <w:rPr>
-                <w:szCs w:val="24"/>
-              </w:rPr>
-            </w:pPr>
-            <w:r>
-              <w:rPr>
-                <w:szCs w:val="24"/>
-              </w:rPr>
-              <w:t>Avg</w:t>
-            </w:r>
-          </w:p>
-        </w:tc>
-        <w:tc>
-          <w:tcPr>
-            <w:tcW w:w="1169" w:type="dxa"/>
-          </w:tcPr>
-          <w:p>
-            <w:pPr>
-              <w:jc w:val="center"/>
-              <w:rPr>
-                <w:szCs w:val="24"/>
-              </w:rPr>
-            </w:pPr>
-            <w:r>
-              <w:rPr>
-                <w:szCs w:val="24"/>
-              </w:rPr>
-              <w:t>GAP (%)</w:t>
-            </w:r>
-          </w:p>
-          <w:p>
-            <w:pPr>
-              <w:jc w:val="center"/>
-              <w:rPr>
-                <w:szCs w:val="24"/>
-              </w:rPr>
-            </w:pPr>
-            <w:r>
-              <w:rPr>
-                <w:szCs w:val="24"/>
-              </w:rPr>
-              <w:t>Avg</w:t>
-            </w:r>
-          </w:p>
-        </w:tc>
-        <w:tc>
-          <w:tcPr>
-            <w:tcW w:w="1169" w:type="dxa"/>
-          </w:tcPr>
-          <w:p>
-            <w:pPr>
-              <w:jc w:val="center"/>
-              <w:rPr>
-                <w:szCs w:val="24"/>
-              </w:rPr>
-            </w:pPr>
-            <w:r>
-              <w:rPr>
-                <w:szCs w:val="24"/>
-              </w:rPr>
-              <w:t>Std</w:t>
-            </w:r>
-          </w:p>
-        </w:tc>
-        <w:tc>
-          <w:tcPr>
-            <w:tcW w:w="1169" w:type="dxa"/>
-          </w:tcPr>
-          <w:p>
-            <w:pPr>
-              <w:jc w:val="center"/>
-              <w:rPr>
-                <w:szCs w:val="24"/>
-              </w:rPr>
-            </w:pPr>
-            <w:r>
-              <w:rPr>
-                <w:szCs w:val="24"/>
-              </w:rPr>
-              <w:t>CV (%)</w:t>
-            </w:r>
-          </w:p>
-        </w:tc>
-        <w:tc>
-          <w:tcPr>
-            <w:tcW w:w="1169" w:type="dxa"/>
-          </w:tcPr>
-          <w:p>
-            <w:pPr>
-              <w:jc w:val="center"/>
-              <w:rPr>
-                <w:szCs w:val="24"/>
-              </w:rPr>
-            </w:pPr>
-            <w:r>
-              <w:rPr>
-                <w:szCs w:val="24"/>
-              </w:rPr>
-              <w:t>Time (s)</w:t>
-            </w:r>
-          </w:p>
-        </w:tc>
-        <w:tc>
-          <w:tcPr>
-            <w:tcW w:w="1169" w:type="dxa"/>
-          </w:tcPr>
-          <w:p>
-            <w:pPr>
-              <w:jc w:val="center"/>
-              <w:rPr>
-                <w:szCs w:val="24"/>
-              </w:rPr>
-            </w:pPr>
-            <w:r>
-              <w:rPr>
-                <w:szCs w:val="24"/>
-              </w:rPr>
-              <w:t>GAP (%)</w:t>
-            </w:r>
-          </w:p>
-          <w:p>
-            <w:pPr>
-              <w:jc w:val="center"/>
-              <w:rPr>
-                <w:szCs w:val="24"/>
-              </w:rPr>
-            </w:pPr>
-            <w:r>
-              <w:rPr>
-                <w:szCs w:val="24"/>
-              </w:rPr>
-              <w:t>Time</w:t>
-            </w:r>
-          </w:p>
-        </w:tc>
-      </w:tr>
-      <w:tr>
-        <w:tc>
-          <w:tcPr>
-            <w:tcW w:w="1168" w:type="dxa"/>
-          </w:tcPr>
-          <w:p>
-            <w:pPr>
-              <w:jc w:val="center"/>
-            </w:pPr>
-            <w:r>
-              <w:t>6</w:t>
-            </w:r>
-          </w:p>
-        </w:tc>
-        <w:tc>
-          <w:tcPr>
-            <w:tcW w:w="1168" w:type="dxa"/>
-          </w:tcPr>
-          <w:p>
-            <w:r>
-              <w:t>82.54</w:t>
-            </w:r>
-          </w:p>
-        </w:tc>
-        <w:tc>
-          <w:tcPr>
-            <w:tcW w:w="1169" w:type="dxa"/>
-          </w:tcPr>
-          <w:p>
-            <w:r>
-              <w:t>83.81</w:t>
-            </w:r>
-          </w:p>
-        </w:tc>
-        <w:tc>
-          <w:tcPr>
-            <w:tcW w:w="1169" w:type="dxa"/>
-          </w:tcPr>
-          <w:p>
-            <w:r>
-              <w:t>-0.57</w:t>
-            </w:r>
-          </w:p>
-        </w:tc>
-        <w:tc>
-          <w:tcPr>
-            <w:tcW w:w="1169" w:type="dxa"/>
-          </w:tcPr>
-          <w:p>
-            <w:r>
-              <w:t>0.47</w:t>
-            </w:r>
-          </w:p>
-        </w:tc>
-        <w:tc>
-          <w:tcPr>
-            <w:tcW w:w="1169" w:type="dxa"/>
-          </w:tcPr>
-          <w:p>
-            <w:r>
-              <w:t>0.56</w:t>
-            </w:r>
-          </w:p>
-        </w:tc>
-        <w:tc>
-          <w:tcPr>
-            <w:tcW w:w="1169" w:type="dxa"/>
-          </w:tcPr>
-          <w:p>
-            <w:r>
-              <w:t>14.81</w:t>
-            </w:r>
-          </w:p>
-        </w:tc>
-        <w:tc>
-          <w:tcPr>
-            <w:tcW w:w="1169" w:type="dxa"/>
-          </w:tcPr>
-          <w:p>
-            <w:r>
-              <w:t>-42.04</w:t>
-            </w:r>
-          </w:p>
-        </w:tc>
-      </w:tr>
-      <w:tr>
-        <w:tc>
-          <w:tcPr>
-            <w:tcW w:w="1168" w:type="dxa"/>
-          </w:tcPr>
-          <w:p>
-            <w:pPr>
-              <w:jc w:val="center"/>
-            </w:pPr>
-            <w:r>
-              <w:t>7</w:t>
-            </w:r>
-          </w:p>
-        </w:tc>
-        <w:tc>
-          <w:tcPr>
-            <w:tcW w:w="1168" w:type="dxa"/>
-          </w:tcPr>
-          <w:p>
-            <w:r>
-              <w:t>82.53</w:t>
-            </w:r>
-          </w:p>
-        </w:tc>
-        <w:tc>
-          <w:tcPr>
-            <w:tcW w:w="1169" w:type="dxa"/>
-          </w:tcPr>
-          <w:p>
-            <w:r>
-              <w:t>83.95</w:t>
-            </w:r>
-          </w:p>
-        </w:tc>
-        <w:tc>
-          <w:tcPr>
-            <w:tcW w:w="1169" w:type="dxa"/>
-          </w:tcPr>
-          <w:p>
-            <w:r>
-              <w:t>-0.40</w:t>
-            </w:r>
-          </w:p>
-        </w:tc>
-        <w:tc>
-          <w:tcPr>
-            <w:tcW w:w="1169" w:type="dxa"/>
-          </w:tcPr>
-          <w:p>
-            <w:r>
-              <w:t>0.46</w:t>
-            </w:r>
-          </w:p>
-        </w:tc>
-        <w:tc>
-          <w:tcPr>
-            <w:tcW w:w="1169" w:type="dxa"/>
-          </w:tcPr>
-          <w:p>
-            <w:r>
-              <w:t>0.55</w:t>
-            </w:r>
-          </w:p>
-        </w:tc>
-        <w:tc>
-          <w:tcPr>
-            <w:tcW w:w="1169" w:type="dxa"/>
-          </w:tcPr>
-          <w:p>
-            <w:r>
-              <w:t>15.27</w:t>
-            </w:r>
-          </w:p>
-        </w:tc>
-        <w:tc>
-          <w:tcPr>
-            <w:tcW w:w="1169" w:type="dxa"/>
-          </w:tcPr>
-          <w:p>
-            <w:r>
-              <w:t>-40.23</w:t>
-            </w:r>
-          </w:p>
-        </w:tc>
-      </w:tr>
-      <w:tr>
-        <w:tc>
-          <w:tcPr>
-            <w:tcW w:w="1168" w:type="dxa"/>
-          </w:tcPr>
-          <w:p>
-            <w:pPr>
-              <w:jc w:val="center"/>
-            </w:pPr>
-            <w:r>
-              <w:t>8</w:t>
-            </w:r>
-          </w:p>
-        </w:tc>
-        <w:tc>
-          <w:tcPr>
-            <w:tcW w:w="1168" w:type="dxa"/>
-          </w:tcPr>
-          <w:p>
-            <w:r>
-              <w:t>82.26</w:t>
-            </w:r>
-          </w:p>
-        </w:tc>
-        <w:tc>
-          <w:tcPr>
-            <w:tcW w:w="1169" w:type="dxa"/>
-          </w:tcPr>
-          <w:p>
-            <w:r>
-              <w:t>83.57</w:t>
-            </w:r>
-          </w:p>
-        </w:tc>
-        <w:tc>
-          <w:tcPr>
-            <w:tcW w:w="1169" w:type="dxa"/>
-          </w:tcPr>
-          <w:p>
-            <w:r>
-              <w:t>-0.85</w:t>
-            </w:r>
-          </w:p>
-        </w:tc>
-        <w:tc>
-          <w:tcPr>
-            <w:tcW w:w="1169" w:type="dxa"/>
-          </w:tcPr>
-          <w:p>
-            <w:r>
-              <w:t>0.53</w:t>
-            </w:r>
-          </w:p>
-        </w:tc>
-        <w:tc>
-          <w:tcPr>
-            <w:tcW w:w="1169" w:type="dxa"/>
-          </w:tcPr>
-          <w:p>
-            <w:r>
-              <w:t>0.64</w:t>
-            </w:r>
-          </w:p>
-        </w:tc>
-        <w:tc>
-          <w:tcPr>
-            <w:tcW w:w="1169" w:type="dxa"/>
-          </w:tcPr>
-          <w:p>
-            <w:r>
-              <w:t>16.27</w:t>
-            </w:r>
-          </w:p>
-        </w:tc>
-        <w:tc>
-          <w:tcPr>
-            <w:tcW w:w="1169" w:type="dxa"/>
-          </w:tcPr>
-          <w:p>
-            <w:r>
-              <w:t>-36.32</w:t>
-            </w:r>
-          </w:p>
-        </w:tc>
-      </w:tr>
-      <w:tr>
-        <w:tc>
-          <w:tcPr>
-            <w:tcW w:w="1168" w:type="dxa"/>
-          </w:tcPr>
-          <w:p>
-            <w:pPr>
-              <w:jc w:val="center"/>
-            </w:pPr>
-            <w:r>
-              <w:t>9</w:t>
-            </w:r>
-          </w:p>
-        </w:tc>
-        <w:tc>
-          <w:tcPr>
-            <w:tcW w:w="1168" w:type="dxa"/>
-          </w:tcPr>
-          <w:p>
-            <w:r>
-              <w:t>82.43</w:t>
-            </w:r>
-          </w:p>
-        </w:tc>
-        <w:tc>
-          <w:tcPr>
-            <w:tcW w:w="1169" w:type="dxa"/>
-          </w:tcPr>
-          <w:p>
-            <w:r>
-              <w:t>83.52</w:t>
-            </w:r>
-          </w:p>
-        </w:tc>
-        <w:tc>
-          <w:tcPr>
-            <w:tcW w:w="1169" w:type="dxa"/>
-          </w:tcPr>
-          <w:p>
-            <w:r>
-              <w:t>-0.91</w:t>
-            </w:r>
-          </w:p>
-        </w:tc>
-        <w:tc>
-          <w:tcPr>
-            <w:tcW w:w="1169" w:type="dxa"/>
-          </w:tcPr>
-          <w:p>
-            <w:r>
-              <w:t>0.42</w:t>
-            </w:r>
-          </w:p>
-        </w:tc>
-        <w:tc>
-          <w:tcPr>
-            <w:tcW w:w="1169" w:type="dxa"/>
-          </w:tcPr>
-          <w:p>
-            <w:r>
-              <w:t>0.50</w:t>
-            </w:r>
-          </w:p>
-        </w:tc>
-        <w:tc>
-          <w:tcPr>
-            <w:tcW w:w="1169" w:type="dxa"/>
-          </w:tcPr>
-          <w:p>
-            <w:r>
-              <w:t>17.33</w:t>
-            </w:r>
-          </w:p>
-        </w:tc>
-        <w:tc>
-          <w:tcPr>
-            <w:tcW w:w="1169" w:type="dxa"/>
-          </w:tcPr>
-          <w:p>
-            <w:r>
-              <w:t>-32.17</w:t>
-            </w:r>
-          </w:p>
-        </w:tc>
-      </w:tr>
-    </w:tbl>
-    <w:p>
-      <w:r>
-        <w:t>* Baseline: 82.61</w:t>
-      </w:r>
-      <w:r>
-        <w:t xml:space="preserve"> (Best), 0.56 (Std), 0.66% (CV)</w:t>
+        <w:drawing>
+          <wp:inline distT="0" distB="0" distL="0" distR="0" wp14:anchorId="384F40F6" wp14:editId="4FDA87B3">
+            <wp:extent cx="5943600" cy="2656840"/>
+            <wp:effectExtent l="0" t="0" r="0" b="0"/>
+            <wp:docPr id="4" name="Picture 4"/>
+            <wp:cNvGraphicFramePr>
+              <a:graphicFrameLocks xmlns:a="http://schemas.openxmlformats.org/drawingml/2006/main" noChangeAspect="1"/>
+            </wp:cNvGraphicFramePr>
+            <a:graphic xmlns:a="http://schemas.openxmlformats.org/drawingml/2006/main">
+              <a:graphicData uri="http://schemas.openxmlformats.org/drawingml/2006/picture">
+                <pic:pic xmlns:pic="http://schemas.openxmlformats.org/drawingml/2006/picture">
+                  <pic:nvPicPr>
+                    <pic:cNvPr id="4" name="Picture 4"/>
+                    <pic:cNvPicPr/>
+                  </pic:nvPicPr>
+                  <pic:blipFill>
+                    <a:blip r:embed="rId12" cstate="print">
+                      <a:extLst>
+                        <a:ext uri="{28A0092B-C50C-407E-A947-70E740481C1C}">
+                          <a14:useLocalDpi xmlns:a14="http://schemas.microsoft.com/office/drawing/2010/main" val="0"/>
+                        </a:ext>
+                      </a:extLst>
+                    </a:blip>
+                    <a:stretch>
+                      <a:fillRect/>
+                    </a:stretch>
+                  </pic:blipFill>
+                  <pic:spPr>
+                    <a:xfrm>
+                      <a:off x="0" y="0"/>
+                      <a:ext cx="5943600" cy="2656840"/>
+                    </a:xfrm>
+                    <a:prstGeom prst="rect">
+                      <a:avLst/>
+                    </a:prstGeom>
+                  </pic:spPr>
+                </pic:pic>
+              </a:graphicData>
+            </a:graphic>
+          </wp:inline>
+        </w:drawing>
       </w:r>
     </w:p>
     <w:p>
@@ -16947,37 +16233,28 @@
         <w:t xml:space="preserve"> so sánh với baseline tuần tự trên các kích thước Customers.</w:t>
       </w:r>
       <w:r>
-        <w:t xml:space="preserve"> Trong đó: </w:t>
+        <w:t xml:space="preserve"> </w:t>
+      </w:r>
+      <w:r>
+        <w:t xml:space="preserve">Trong đó: </w:t>
       </w:r>
       <w:r>
         <w:rPr>
           <w:rFonts w:cs="Times New Roman"/>
         </w:rPr>
-        <w:t xml:space="preserve">µ = </w:t>
+        <w:t xml:space="preserve">µ = 6 chọn </w:t>
       </w:r>
       <w:r>
         <w:rPr>
           <w:rFonts w:cs="Times New Roman"/>
         </w:rPr>
-        <w:t xml:space="preserve">6 chọn topk làm chiến lược pull elite, </w:t>
+        <w:t>top</w:t>
       </w:r>
       <w:r>
         <w:rPr>
           <w:rFonts w:cs="Times New Roman"/>
         </w:rPr>
-        <w:t xml:space="preserve">µ = </w:t>
-      </w:r>
-      <w:r>
-        <w:rPr>
-          <w:rFonts w:cs="Times New Roman"/>
-        </w:rPr>
-        <w:t>12 chọn rank làm chiến lược pull elite</w:t>
-      </w:r>
-      <w:r>
-        <w:rPr>
-          <w:rFonts w:cs="Times New Roman"/>
-        </w:rPr>
-        <w:t>.</w:t>
+        <w:t>k làm chiến lược pull elite và có đa dạng tham số chấm điểm; µ = 12 chọn rank làm chiến lược pull elite và cố định tham số chấm điểm.</w:t>
       </w:r>
     </w:p>
     <w:tbl>
@@ -18351,10 +17628,7 @@
           </w:tcPr>
           <w:p>
             <w:r>
-              <w:t>0.0</w:t>
-            </w:r>
-            <w:r>
-              <w:t>4</w:t>
+              <w:t>0.04</w:t>
             </w:r>
           </w:p>
         </w:tc>
@@ -18491,10 +17765,7 @@
           </w:tcPr>
           <w:p>
             <w:r>
-              <w:t>0.0</w:t>
-            </w:r>
-            <w:r>
-              <w:t>5</w:t>
+              <w:t>0.05</w:t>
             </w:r>
           </w:p>
         </w:tc>
@@ -19482,6 +18753,119 @@
     </w:lvl>
   </w:abstractNum>
   <w:abstractNum w:abstractNumId="2" w15:restartNumberingAfterBreak="0">
+    <w:nsid w:val="138F0A1D"/>
+    <w:multiLevelType w:val="hybridMultilevel"/>
+    <w:tmpl w:val="54B2B01E"/>
+    <w:lvl w:ilvl="0" w:tplc="04090001">
+      <w:start w:val="1"/>
+      <w:numFmt w:val="bullet"/>
+      <w:lvlText w:val=""/>
+      <w:lvlJc w:val="left"/>
+      <w:pPr>
+        <w:ind w:left="720" w:hanging="360"/>
+      </w:pPr>
+      <w:rPr>
+        <w:rFonts w:ascii="Symbol" w:hAnsi="Symbol" w:hint="default"/>
+      </w:rPr>
+    </w:lvl>
+    <w:lvl w:ilvl="1" w:tplc="04090003" w:tentative="1">
+      <w:start w:val="1"/>
+      <w:numFmt w:val="bullet"/>
+      <w:lvlText w:val="o"/>
+      <w:lvlJc w:val="left"/>
+      <w:pPr>
+        <w:ind w:left="1440" w:hanging="360"/>
+      </w:pPr>
+      <w:rPr>
+        <w:rFonts w:ascii="Courier New" w:hAnsi="Courier New" w:cs="Courier New" w:hint="default"/>
+      </w:rPr>
+    </w:lvl>
+    <w:lvl w:ilvl="2" w:tplc="04090005" w:tentative="1">
+      <w:start w:val="1"/>
+      <w:numFmt w:val="bullet"/>
+      <w:lvlText w:val=""/>
+      <w:lvlJc w:val="left"/>
+      <w:pPr>
+        <w:ind w:left="2160" w:hanging="360"/>
+      </w:pPr>
+      <w:rPr>
+        <w:rFonts w:ascii="Wingdings" w:hAnsi="Wingdings" w:hint="default"/>
+      </w:rPr>
+    </w:lvl>
+    <w:lvl w:ilvl="3" w:tplc="04090001" w:tentative="1">
+      <w:start w:val="1"/>
+      <w:numFmt w:val="bullet"/>
+      <w:lvlText w:val=""/>
+      <w:lvlJc w:val="left"/>
+      <w:pPr>
+        <w:ind w:left="2880" w:hanging="360"/>
+      </w:pPr>
+      <w:rPr>
+        <w:rFonts w:ascii="Symbol" w:hAnsi="Symbol" w:hint="default"/>
+      </w:rPr>
+    </w:lvl>
+    <w:lvl w:ilvl="4" w:tplc="04090003" w:tentative="1">
+      <w:start w:val="1"/>
+      <w:numFmt w:val="bullet"/>
+      <w:lvlText w:val="o"/>
+      <w:lvlJc w:val="left"/>
+      <w:pPr>
+        <w:ind w:left="3600" w:hanging="360"/>
+      </w:pPr>
+      <w:rPr>
+        <w:rFonts w:ascii="Courier New" w:hAnsi="Courier New" w:cs="Courier New" w:hint="default"/>
+      </w:rPr>
+    </w:lvl>
+    <w:lvl w:ilvl="5" w:tplc="04090005" w:tentative="1">
+      <w:start w:val="1"/>
+      <w:numFmt w:val="bullet"/>
+      <w:lvlText w:val=""/>
+      <w:lvlJc w:val="left"/>
+      <w:pPr>
+        <w:ind w:left="4320" w:hanging="360"/>
+      </w:pPr>
+      <w:rPr>
+        <w:rFonts w:ascii="Wingdings" w:hAnsi="Wingdings" w:hint="default"/>
+      </w:rPr>
+    </w:lvl>
+    <w:lvl w:ilvl="6" w:tplc="04090001" w:tentative="1">
+      <w:start w:val="1"/>
+      <w:numFmt w:val="bullet"/>
+      <w:lvlText w:val=""/>
+      <w:lvlJc w:val="left"/>
+      <w:pPr>
+        <w:ind w:left="5040" w:hanging="360"/>
+      </w:pPr>
+      <w:rPr>
+        <w:rFonts w:ascii="Symbol" w:hAnsi="Symbol" w:hint="default"/>
+      </w:rPr>
+    </w:lvl>
+    <w:lvl w:ilvl="7" w:tplc="04090003" w:tentative="1">
+      <w:start w:val="1"/>
+      <w:numFmt w:val="bullet"/>
+      <w:lvlText w:val="o"/>
+      <w:lvlJc w:val="left"/>
+      <w:pPr>
+        <w:ind w:left="5760" w:hanging="360"/>
+      </w:pPr>
+      <w:rPr>
+        <w:rFonts w:ascii="Courier New" w:hAnsi="Courier New" w:cs="Courier New" w:hint="default"/>
+      </w:rPr>
+    </w:lvl>
+    <w:lvl w:ilvl="8" w:tplc="04090005" w:tentative="1">
+      <w:start w:val="1"/>
+      <w:numFmt w:val="bullet"/>
+      <w:lvlText w:val=""/>
+      <w:lvlJc w:val="left"/>
+      <w:pPr>
+        <w:ind w:left="6480" w:hanging="360"/>
+      </w:pPr>
+      <w:rPr>
+        <w:rFonts w:ascii="Wingdings" w:hAnsi="Wingdings" w:hint="default"/>
+      </w:rPr>
+    </w:lvl>
+  </w:abstractNum>
+  <w:abstractNum w:abstractNumId="3" w15:restartNumberingAfterBreak="0">
     <w:nsid w:val="1E42002E"/>
     <w:multiLevelType w:val="multilevel"/>
     <w:tmpl w:val="1E42002E"/>
@@ -19594,7 +18978,7 @@
       </w:rPr>
     </w:lvl>
   </w:abstractNum>
-  <w:abstractNum w:abstractNumId="3" w15:restartNumberingAfterBreak="0">
+  <w:abstractNum w:abstractNumId="4" w15:restartNumberingAfterBreak="0">
     <w:nsid w:val="3375478F"/>
     <w:multiLevelType w:val="multilevel"/>
     <w:tmpl w:val="3375478F"/>
@@ -19707,7 +19091,7 @@
       </w:rPr>
     </w:lvl>
   </w:abstractNum>
-  <w:abstractNum w:abstractNumId="4" w15:restartNumberingAfterBreak="0">
+  <w:abstractNum w:abstractNumId="5" w15:restartNumberingAfterBreak="0">
     <w:nsid w:val="68445019"/>
     <w:multiLevelType w:val="hybridMultilevel"/>
     <w:tmpl w:val="17BCDD92"/>
@@ -19820,7 +19204,7 @@
       </w:rPr>
     </w:lvl>
   </w:abstractNum>
-  <w:abstractNum w:abstractNumId="5" w15:restartNumberingAfterBreak="0">
+  <w:abstractNum w:abstractNumId="6" w15:restartNumberingAfterBreak="0">
     <w:nsid w:val="6EE76D5A"/>
     <w:multiLevelType w:val="multilevel"/>
     <w:tmpl w:val="6EE76D5A"/>
@@ -19937,19 +19321,22 @@
     <w:abstractNumId w:val="0"/>
   </w:num>
   <w:num w:numId="2">
-    <w:abstractNumId w:val="5"/>
+    <w:abstractNumId w:val="6"/>
   </w:num>
   <w:num w:numId="3">
-    <w:abstractNumId w:val="2"/>
+    <w:abstractNumId w:val="3"/>
   </w:num>
   <w:num w:numId="4">
-    <w:abstractNumId w:val="3"/>
+    <w:abstractNumId w:val="4"/>
   </w:num>
   <w:num w:numId="5">
     <w:abstractNumId w:val="1"/>
   </w:num>
   <w:num w:numId="6">
-    <w:abstractNumId w:val="4"/>
+    <w:abstractNumId w:val="5"/>
+  </w:num>
+  <w:num w:numId="7">
+    <w:abstractNumId w:val="2"/>
   </w:num>
 </w:numbering>
 </file>
@@ -20343,7 +19730,7 @@
   <w:style w:type="paragraph" w:default="1" w:styleId="Normal">
     <w:name w:val="Normal"/>
     <w:qFormat/>
-    <w:rsid w:val="003C74AD"/>
+    <w:rsid w:val="001C63E7"/>
     <w:pPr>
       <w:spacing w:after="160" w:line="259" w:lineRule="auto"/>
       <w:jc w:val="both"/>
@@ -20424,7 +19811,6 @@
   <w:style w:type="character" w:default="1" w:styleId="DefaultParagraphFont">
     <w:name w:val="Default Paragraph Font"/>
     <w:uiPriority w:val="1"/>
-    <w:semiHidden/>
     <w:unhideWhenUsed/>
   </w:style>
   <w:style w:type="table" w:default="1" w:styleId="TableNormal">

</xml_diff>

<commit_message>
add num-workers, num-customers outputs
</commit_message>
<xml_diff>
--- a/master-slave/evaluate-results/danh-gia-ket-qua-2.docx
+++ b/master-slave/evaluate-results/danh-gia-ket-qua-2.docx
@@ -9101,10 +9101,7 @@
         <w:t xml:space="preserve"> so với các chiến lược khác</w:t>
       </w:r>
       <w:r>
-        <w:t xml:space="preserve"> (</w:t>
-      </w:r>
-      <w:r>
-        <w:t xml:space="preserve">Chiến lược </w:t>
+        <w:t xml:space="preserve"> (Chiến lược </w:t>
       </w:r>
       <w:r>
         <w:rPr>
@@ -9157,6 +9154,34 @@
       </w:r>
       <w:r>
         <w:t>.</w:t>
+      </w:r>
+    </w:p>
+    <w:p>
+      <w:pPr>
+        <w:ind w:left="1080"/>
+      </w:pPr>
+      <w:r>
+        <w:t xml:space="preserve">=&gt; Chọn chiến lược </w:t>
+      </w:r>
+      <w:r>
+        <w:rPr>
+          <w:b/>
+          <w:bCs/>
+        </w:rPr>
+        <w:t>topk</w:t>
+      </w:r>
+      <w:r>
+        <w:t xml:space="preserve"> hoặc </w:t>
+      </w:r>
+      <w:r>
+        <w:rPr>
+          <w:b/>
+          <w:bCs/>
+        </w:rPr>
+        <w:t>rank</w:t>
+      </w:r>
+      <w:r>
+        <w:t xml:space="preserve"> làm chiến lược pull elite.</w:t>
       </w:r>
     </w:p>
     <w:tbl>
@@ -10401,6 +10426,7 @@
               <w:jc w:val="center"/>
             </w:pPr>
             <w:r>
+              <w:lastRenderedPageBreak/>
               <w:t>0.6</w:t>
             </w:r>
           </w:p>
@@ -10421,6 +10447,7 @@
                 <w:sz w:val="22"/>
                 <w:szCs w:val="20"/>
               </w:rPr>
+              <w:lastRenderedPageBreak/>
               <w:t>Random</w:t>
             </w:r>
           </w:p>
@@ -16377,6 +16404,7 @@
     </w:p>
     <w:p>
       <w:r>
+        <w:lastRenderedPageBreak/>
         <w:t>=&gt; Nhận xét:</w:t>
       </w:r>
     </w:p>
@@ -16389,7 +16417,6 @@
         </w:numPr>
       </w:pPr>
       <w:r>
-        <w:lastRenderedPageBreak/>
         <w:t>Biểu đồ hội tụ đều có dạng hàm mũ giảm đặc trưng: cost giảm rất nhanh trong 2-3 giây đầu khi không gian tìm kiếm còn rộng, sau đó chậm dần và tiệm cận về giá trị tối ưu cục bộ.</w:t>
       </w:r>
     </w:p>
@@ -16406,15 +16433,23 @@
       </w:r>
     </w:p>
     <w:p>
+      <w:pPr>
+        <w:jc w:val="left"/>
+      </w:pPr>
+      <w:r>
+        <w:t>Chiến lược topk:</w:t>
+      </w:r>
+    </w:p>
+    <w:p>
       <w:r>
         <w:rPr>
           <w:noProof/>
         </w:rPr>
         <w:drawing>
-          <wp:inline distT="0" distB="0" distL="0" distR="0" wp14:anchorId="7D844DBB" wp14:editId="56F948B5">
+          <wp:inline distT="0" distB="0" distL="0" distR="0" wp14:anchorId="345DAD4D" wp14:editId="13FFB5E1">
             <wp:extent cx="5943600" cy="2971800"/>
             <wp:effectExtent l="0" t="0" r="0" b="0"/>
-            <wp:docPr id="11" name="Picture 11"/>
+            <wp:docPr id="7" name="Picture 7"/>
             <wp:cNvGraphicFramePr>
               <a:graphicFrameLocks xmlns:a="http://schemas.openxmlformats.org/drawingml/2006/main" noChangeAspect="1"/>
             </wp:cNvGraphicFramePr>
@@ -16422,7 +16457,7 @@
               <a:graphicData uri="http://schemas.openxmlformats.org/drawingml/2006/picture">
                 <pic:pic xmlns:pic="http://schemas.openxmlformats.org/drawingml/2006/picture">
                   <pic:nvPicPr>
-                    <pic:cNvPr id="11" name="Picture 11"/>
+                    <pic:cNvPr id="7" name="Picture 7"/>
                     <pic:cNvPicPr/>
                   </pic:nvPicPr>
                   <pic:blipFill>
@@ -16459,10 +16494,10 @@
           <w:noProof/>
         </w:rPr>
         <w:drawing>
-          <wp:inline distT="0" distB="0" distL="0" distR="0" wp14:anchorId="63A860B3" wp14:editId="4D12C86D">
+          <wp:inline distT="0" distB="0" distL="0" distR="0" wp14:anchorId="00652789" wp14:editId="67838F9A">
             <wp:extent cx="5943600" cy="2971800"/>
             <wp:effectExtent l="0" t="0" r="0" b="0"/>
-            <wp:docPr id="12" name="Picture 12"/>
+            <wp:docPr id="8" name="Picture 8"/>
             <wp:cNvGraphicFramePr>
               <a:graphicFrameLocks xmlns:a="http://schemas.openxmlformats.org/drawingml/2006/main" noChangeAspect="1"/>
             </wp:cNvGraphicFramePr>
@@ -16470,7 +16505,7 @@
               <a:graphicData uri="http://schemas.openxmlformats.org/drawingml/2006/picture">
                 <pic:pic xmlns:pic="http://schemas.openxmlformats.org/drawingml/2006/picture">
                   <pic:nvPicPr>
-                    <pic:cNvPr id="12" name="Picture 12"/>
+                    <pic:cNvPr id="8" name="Picture 8"/>
                     <pic:cNvPicPr/>
                   </pic:nvPicPr>
                   <pic:blipFill>
@@ -16502,6 +16537,108 @@
       </w:r>
     </w:p>
     <w:p>
+      <w:r>
+        <w:t>Chiến lược rank:</w:t>
+      </w:r>
+    </w:p>
+    <w:p>
+      <w:r>
+        <w:rPr>
+          <w:noProof/>
+        </w:rPr>
+        <w:lastRenderedPageBreak/>
+        <w:drawing>
+          <wp:inline distT="0" distB="0" distL="0" distR="0" wp14:anchorId="5166055D" wp14:editId="1C48DCAF">
+            <wp:extent cx="5943600" cy="2971800"/>
+            <wp:effectExtent l="0" t="0" r="0" b="0"/>
+            <wp:docPr id="9" name="Picture 9"/>
+            <wp:cNvGraphicFramePr>
+              <a:graphicFrameLocks xmlns:a="http://schemas.openxmlformats.org/drawingml/2006/main" noChangeAspect="1"/>
+            </wp:cNvGraphicFramePr>
+            <a:graphic xmlns:a="http://schemas.openxmlformats.org/drawingml/2006/main">
+              <a:graphicData uri="http://schemas.openxmlformats.org/drawingml/2006/picture">
+                <pic:pic xmlns:pic="http://schemas.openxmlformats.org/drawingml/2006/picture">
+                  <pic:nvPicPr>
+                    <pic:cNvPr id="9" name="Picture 9"/>
+                    <pic:cNvPicPr/>
+                  </pic:nvPicPr>
+                  <pic:blipFill>
+                    <a:blip r:embed="rId9" cstate="print">
+                      <a:extLst>
+                        <a:ext uri="{28A0092B-C50C-407E-A947-70E740481C1C}">
+                          <a14:useLocalDpi xmlns:a14="http://schemas.microsoft.com/office/drawing/2010/main" val="0"/>
+                        </a:ext>
+                      </a:extLst>
+                    </a:blip>
+                    <a:stretch>
+                      <a:fillRect/>
+                    </a:stretch>
+                  </pic:blipFill>
+                  <pic:spPr>
+                    <a:xfrm>
+                      <a:off x="0" y="0"/>
+                      <a:ext cx="5943600" cy="2971800"/>
+                    </a:xfrm>
+                    <a:prstGeom prst="rect">
+                      <a:avLst/>
+                    </a:prstGeom>
+                  </pic:spPr>
+                </pic:pic>
+              </a:graphicData>
+            </a:graphic>
+          </wp:inline>
+        </w:drawing>
+      </w:r>
+    </w:p>
+    <w:p>
+      <w:r>
+        <w:rPr>
+          <w:noProof/>
+        </w:rPr>
+        <w:drawing>
+          <wp:inline distT="0" distB="0" distL="0" distR="0" wp14:anchorId="24A02097" wp14:editId="0027EB93">
+            <wp:extent cx="5943600" cy="2971800"/>
+            <wp:effectExtent l="0" t="0" r="0" b="0"/>
+            <wp:docPr id="10" name="Picture 10"/>
+            <wp:cNvGraphicFramePr>
+              <a:graphicFrameLocks xmlns:a="http://schemas.openxmlformats.org/drawingml/2006/main" noChangeAspect="1"/>
+            </wp:cNvGraphicFramePr>
+            <a:graphic xmlns:a="http://schemas.openxmlformats.org/drawingml/2006/main">
+              <a:graphicData uri="http://schemas.openxmlformats.org/drawingml/2006/picture">
+                <pic:pic xmlns:pic="http://schemas.openxmlformats.org/drawingml/2006/picture">
+                  <pic:nvPicPr>
+                    <pic:cNvPr id="10" name="Picture 10"/>
+                    <pic:cNvPicPr/>
+                  </pic:nvPicPr>
+                  <pic:blipFill>
+                    <a:blip r:embed="rId10" cstate="print">
+                      <a:extLst>
+                        <a:ext uri="{28A0092B-C50C-407E-A947-70E740481C1C}">
+                          <a14:useLocalDpi xmlns:a14="http://schemas.microsoft.com/office/drawing/2010/main" val="0"/>
+                        </a:ext>
+                      </a:extLst>
+                    </a:blip>
+                    <a:stretch>
+                      <a:fillRect/>
+                    </a:stretch>
+                  </pic:blipFill>
+                  <pic:spPr>
+                    <a:xfrm>
+                      <a:off x="0" y="0"/>
+                      <a:ext cx="5943600" cy="2971800"/>
+                    </a:xfrm>
+                    <a:prstGeom prst="rect">
+                      <a:avLst/>
+                    </a:prstGeom>
+                  </pic:spPr>
+                </pic:pic>
+              </a:graphicData>
+            </a:graphic>
+          </wp:inline>
+        </w:drawing>
+      </w:r>
+    </w:p>
+    <w:p>
       <w:pPr>
         <w:pStyle w:val="Heading1"/>
       </w:pPr>
@@ -16592,7 +16729,6 @@
     </w:p>
     <w:p>
       <w:r>
-        <w:lastRenderedPageBreak/>
         <w:t>=&gt; Nhận xét:</w:t>
       </w:r>
     </w:p>
@@ -16623,6 +16759,7 @@
         </w:numPr>
       </w:pPr>
       <w:r>
+        <w:lastRenderedPageBreak/>
         <w:t xml:space="preserve">Thời gian chạy </w:t>
       </w:r>
       <w:r>
@@ -16634,10 +16771,7 @@
         <w:jc w:val="left"/>
       </w:pPr>
       <w:r>
-        <w:t>Chiến lược topk</w:t>
-      </w:r>
-      <w:r>
-        <w:t>:</w:t>
+        <w:t>Chiến lược topk:</w:t>
       </w:r>
     </w:p>
     <w:p>
@@ -16646,10 +16780,10 @@
           <w:noProof/>
         </w:rPr>
         <w:drawing>
-          <wp:inline distT="0" distB="0" distL="0" distR="0" wp14:anchorId="43091ECD" wp14:editId="761B6D83">
+          <wp:inline distT="0" distB="0" distL="0" distR="0" wp14:anchorId="43DD6F37" wp14:editId="1A02F861">
             <wp:extent cx="5943600" cy="2658745"/>
             <wp:effectExtent l="0" t="0" r="0" b="8255"/>
-            <wp:docPr id="1" name="Picture 1"/>
+            <wp:docPr id="3" name="Picture 3"/>
             <wp:cNvGraphicFramePr>
               <a:graphicFrameLocks xmlns:a="http://schemas.openxmlformats.org/drawingml/2006/main" noChangeAspect="1"/>
             </wp:cNvGraphicFramePr>
@@ -16657,11 +16791,11 @@
               <a:graphicData uri="http://schemas.openxmlformats.org/drawingml/2006/picture">
                 <pic:pic xmlns:pic="http://schemas.openxmlformats.org/drawingml/2006/picture">
                   <pic:nvPicPr>
-                    <pic:cNvPr id="1" name="Picture 1"/>
+                    <pic:cNvPr id="3" name="Picture 3"/>
                     <pic:cNvPicPr/>
                   </pic:nvPicPr>
                   <pic:blipFill>
-                    <a:blip r:embed="rId9" cstate="print">
+                    <a:blip r:embed="rId11" cstate="print">
                       <a:extLst>
                         <a:ext uri="{28A0092B-C50C-407E-A947-70E740481C1C}">
                           <a14:useLocalDpi xmlns:a14="http://schemas.microsoft.com/office/drawing/2010/main" val="0"/>
@@ -16702,10 +16836,10 @@
           <w:noProof/>
         </w:rPr>
         <w:drawing>
-          <wp:inline distT="0" distB="0" distL="0" distR="0" wp14:anchorId="1177E1C3" wp14:editId="59808A20">
+          <wp:inline distT="0" distB="0" distL="0" distR="0" wp14:anchorId="2CB0DECA" wp14:editId="27AD0BCC">
             <wp:extent cx="5943600" cy="2658745"/>
             <wp:effectExtent l="0" t="0" r="0" b="8255"/>
-            <wp:docPr id="2" name="Picture 2"/>
+            <wp:docPr id="4" name="Picture 4"/>
             <wp:cNvGraphicFramePr>
               <a:graphicFrameLocks xmlns:a="http://schemas.openxmlformats.org/drawingml/2006/main" noChangeAspect="1"/>
             </wp:cNvGraphicFramePr>
@@ -16713,11 +16847,11 @@
               <a:graphicData uri="http://schemas.openxmlformats.org/drawingml/2006/picture">
                 <pic:pic xmlns:pic="http://schemas.openxmlformats.org/drawingml/2006/picture">
                   <pic:nvPicPr>
-                    <pic:cNvPr id="2" name="Picture 2"/>
+                    <pic:cNvPr id="4" name="Picture 4"/>
                     <pic:cNvPicPr/>
                   </pic:nvPicPr>
                   <pic:blipFill>
-                    <a:blip r:embed="rId10" cstate="print">
+                    <a:blip r:embed="rId12" cstate="print">
                       <a:extLst>
                         <a:ext uri="{28A0092B-C50C-407E-A947-70E740481C1C}">
                           <a14:useLocalDpi xmlns:a14="http://schemas.microsoft.com/office/drawing/2010/main" val="0"/>
@@ -16821,7 +16955,6 @@
           <w:bCs/>
           <w:u w:val="single"/>
         </w:rPr>
-        <w:lastRenderedPageBreak/>
         <w:t>Chiến lược topk:</w:t>
       </w:r>
     </w:p>
@@ -16856,6 +16989,7 @@
               <w:jc w:val="center"/>
             </w:pPr>
             <w:r>
+              <w:lastRenderedPageBreak/>
               <w:t>Customers</w:t>
             </w:r>
           </w:p>
@@ -17919,10 +18053,7 @@
               <w:t>8</w:t>
             </w:r>
             <w:r>
-              <w:t>1.</w:t>
-            </w:r>
-            <w:r>
-              <w:t>18</w:t>
+              <w:t>0.86</w:t>
             </w:r>
           </w:p>
         </w:tc>
@@ -17932,10 +18063,7 @@
           </w:tcPr>
           <w:p>
             <w:r>
-              <w:t>-1.</w:t>
-            </w:r>
-            <w:r>
-              <w:t>73</w:t>
+              <w:t>-2.11</w:t>
             </w:r>
           </w:p>
         </w:tc>
@@ -17948,7 +18076,7 @@
               <w:t>82.</w:t>
             </w:r>
             <w:r>
-              <w:t>97</w:t>
+              <w:t>65</w:t>
             </w:r>
           </w:p>
         </w:tc>
@@ -17958,10 +18086,7 @@
           </w:tcPr>
           <w:p>
             <w:r>
-              <w:t>-</w:t>
-            </w:r>
-            <w:r>
-              <w:t>1.57</w:t>
+              <w:t>-1.94</w:t>
             </w:r>
           </w:p>
         </w:tc>
@@ -17971,7 +18096,13 @@
           </w:tcPr>
           <w:p>
             <w:r>
-              <w:t>0.81</w:t>
+              <w:t>0.</w:t>
+            </w:r>
+            <w:r>
+              <w:t>9</w:t>
+            </w:r>
+            <w:r>
+              <w:t>1</w:t>
             </w:r>
           </w:p>
         </w:tc>
@@ -17981,13 +18112,16 @@
           </w:tcPr>
           <w:p>
             <w:r>
-              <w:t>26.</w:t>
-            </w:r>
-            <w:r>
               <w:t>2</w:t>
             </w:r>
             <w:r>
-              <w:t>0</w:t>
+              <w:t>8</w:t>
+            </w:r>
+            <w:r>
+              <w:t>.0</w:t>
+            </w:r>
+            <w:r>
+              <w:t>1</w:t>
             </w:r>
           </w:p>
         </w:tc>
@@ -19059,7 +19193,7 @@
               <w:t>8</w:t>
             </w:r>
             <w:r>
-              <w:t>1.18</w:t>
+              <w:t>0.86</w:t>
             </w:r>
           </w:p>
         </w:tc>
@@ -19069,10 +19203,10 @@
           </w:tcPr>
           <w:p>
             <w:r>
-              <w:t>-1.</w:t>
-            </w:r>
-            <w:r>
-              <w:t>98</w:t>
+              <w:t>-</w:t>
+            </w:r>
+            <w:r>
+              <w:t>2.37</w:t>
             </w:r>
           </w:p>
         </w:tc>
@@ -19082,7 +19216,7 @@
           </w:tcPr>
           <w:p>
             <w:r>
-              <w:t>82.97</w:t>
+              <w:t>82.65</w:t>
             </w:r>
           </w:p>
         </w:tc>
@@ -19095,30 +19229,45 @@
               <w:t>-</w:t>
             </w:r>
             <w:r>
-              <w:t>1.5</w:t>
-            </w:r>
+              <w:t>1.</w:t>
+            </w:r>
+            <w:r>
+              <w:t>90</w:t>
+            </w:r>
+          </w:p>
+        </w:tc>
+        <w:tc>
+          <w:tcPr>
+            <w:tcW w:w="641" w:type="dxa"/>
+          </w:tcPr>
+          <w:p>
+            <w:r>
+              <w:t>0.</w:t>
+            </w:r>
+            <w:r>
+              <w:t>9</w:t>
+            </w:r>
+            <w:r>
+              <w:t>1</w:t>
+            </w:r>
+          </w:p>
+        </w:tc>
+        <w:tc>
+          <w:tcPr>
+            <w:tcW w:w="772" w:type="dxa"/>
+          </w:tcPr>
+          <w:p>
             <w:r>
               <w:t>2</w:t>
             </w:r>
-          </w:p>
-        </w:tc>
-        <w:tc>
-          <w:tcPr>
-            <w:tcW w:w="641" w:type="dxa"/>
-          </w:tcPr>
-          <w:p>
-            <w:r>
-              <w:t>0.81</w:t>
-            </w:r>
-          </w:p>
-        </w:tc>
-        <w:tc>
-          <w:tcPr>
-            <w:tcW w:w="772" w:type="dxa"/>
-          </w:tcPr>
-          <w:p>
-            <w:r>
-              <w:t>26.20</w:t>
+            <w:r>
+              <w:t>8</w:t>
+            </w:r>
+            <w:r>
+              <w:t>.0</w:t>
+            </w:r>
+            <w:r>
+              <w:t>1</w:t>
             </w:r>
           </w:p>
         </w:tc>
@@ -19489,6 +19638,7 @@
               <w:jc w:val="center"/>
             </w:pPr>
             <w:r>
+              <w:lastRenderedPageBreak/>
               <w:t>6</w:t>
             </w:r>
           </w:p>
@@ -20265,7 +20415,7 @@
               <w:t>.</w:t>
             </w:r>
             <w:r>
-              <w:t>86</w:t>
+              <w:t>64</w:t>
             </w:r>
           </w:p>
         </w:tc>
@@ -20278,7 +20428,10 @@
               <w:t>-</w:t>
             </w:r>
             <w:r>
-              <w:t>2.11</w:t>
+              <w:t>2.</w:t>
+            </w:r>
+            <w:r>
+              <w:t>38</w:t>
             </w:r>
           </w:p>
         </w:tc>
@@ -20291,7 +20444,7 @@
               <w:t>82.</w:t>
             </w:r>
             <w:r>
-              <w:t>62</w:t>
+              <w:t>50</w:t>
             </w:r>
           </w:p>
         </w:tc>
@@ -20304,7 +20457,7 @@
               <w:t>-</w:t>
             </w:r>
             <w:r>
-              <w:t>1.98</w:t>
+              <w:t>2.12</w:t>
             </w:r>
           </w:p>
         </w:tc>
@@ -20317,7 +20470,10 @@
               <w:t>0.</w:t>
             </w:r>
             <w:r>
-              <w:t>96</w:t>
+              <w:t>8</w:t>
+            </w:r>
+            <w:r>
+              <w:t>9</w:t>
             </w:r>
           </w:p>
         </w:tc>
@@ -20327,10 +20483,10 @@
           </w:tcPr>
           <w:p>
             <w:r>
-              <w:t>26.6</w:t>
-            </w:r>
-            <w:r>
-              <w:t>9</w:t>
+              <w:t>26.</w:t>
+            </w:r>
+            <w:r>
+              <w:t>38</w:t>
             </w:r>
           </w:p>
         </w:tc>
@@ -21432,7 +21588,10 @@
               <w:t>8</w:t>
             </w:r>
             <w:r>
-              <w:t>0.86</w:t>
+              <w:t>0.</w:t>
+            </w:r>
+            <w:r>
+              <w:t>64</w:t>
             </w:r>
           </w:p>
         </w:tc>
@@ -21445,7 +21604,10 @@
               <w:t>-2.</w:t>
             </w:r>
             <w:r>
-              <w:t>37</w:t>
+              <w:t>6</w:t>
+            </w:r>
+            <w:r>
+              <w:t>3</w:t>
             </w:r>
           </w:p>
         </w:tc>
@@ -21455,7 +21617,10 @@
           </w:tcPr>
           <w:p>
             <w:r>
-              <w:t>82.62</w:t>
+              <w:t>82.</w:t>
+            </w:r>
+            <w:r>
+              <w:t>50</w:t>
             </w:r>
           </w:p>
         </w:tc>
@@ -21465,7 +21630,10 @@
           </w:tcPr>
           <w:p>
             <w:r>
-              <w:t>-1.93</w:t>
+              <w:t>-</w:t>
+            </w:r>
+            <w:r>
+              <w:t>2.08</w:t>
             </w:r>
           </w:p>
         </w:tc>
@@ -21478,7 +21646,10 @@
               <w:t>0.</w:t>
             </w:r>
             <w:r>
-              <w:t>96</w:t>
+              <w:t>8</w:t>
+            </w:r>
+            <w:r>
+              <w:t>9</w:t>
             </w:r>
           </w:p>
         </w:tc>
@@ -21488,10 +21659,10 @@
           </w:tcPr>
           <w:p>
             <w:r>
-              <w:t>26.6</w:t>
-            </w:r>
-            <w:r>
-              <w:t>9</w:t>
+              <w:t>26.</w:t>
+            </w:r>
+            <w:r>
+              <w:t>38</w:t>
             </w:r>
           </w:p>
         </w:tc>
@@ -22764,7 +22935,7 @@
   <w:style w:type="paragraph" w:default="1" w:styleId="Normal">
     <w:name w:val="Normal"/>
     <w:qFormat/>
-    <w:rsid w:val="00631643"/>
+    <w:rsid w:val="005316BB"/>
     <w:pPr>
       <w:spacing w:after="160" w:line="259" w:lineRule="auto"/>
       <w:jc w:val="both"/>

</xml_diff>